<commit_message>
docs: update frontend guidance and project reports
</commit_message>
<xml_diff>
--- a/CHRONO_A5_Minh_Report.docx
+++ b/CHRONO_A5_Minh_Report.docx
@@ -4,469 +4,40 @@
   <w:body>
     <w:p>
       <w:pPr>
-        <w:pStyle w:val="Subtitle"/>
+        <w:pStyle w:val="Heading1"/>
+        <w:keepNext/>
       </w:pPr>
       <w:r>
-        <w:t>CHRONO A5</w:t>
-      </w:r>
-    </w:p>
-    <w:p>
-      <w:pPr>
-        <w:pStyle w:val="Title"/>
-      </w:pPr>
-      <w:r>
-        <w:t>Database Architecture</w:t>
-        <w:br/>
-        <w:t>and Deployment Report</w:t>
-      </w:r>
-    </w:p>
-    <w:p>
-      <w:pPr>
-        <w:pStyle w:val="Subtitle"/>
-      </w:pPr>
-      <w:r>
-        <w:t>Minh contribution to the final project report</w:t>
-      </w:r>
-    </w:p>
-    <w:p>
-      <w:r>
-        <w:t>AI Smart Scheduling Web Application</w:t>
-        <w:br/>
-        <w:t>17 October 2026</w:t>
-      </w:r>
-    </w:p>
-    <w:p>
-      <w:pPr>
-        <w:pStyle w:val="Heading2"/>
-      </w:pPr>
-      <w:r>
-        <w:t>Report purpose</w:t>
-      </w:r>
-    </w:p>
-    <w:p>
-      <w:r>
-        <w:t>CHRONO stores personal tasks, schedules, focus activity and progress in a PostgreSQL database behind a FastAPI service. This report explains how those records relate, how access is controlled, and how another team member can install and maintain the demonstration system. The database design preserves tasks when a project is deleted and keeps completion times separate from general update times so that reporting remains meaningful.</w:t>
-      </w:r>
-    </w:p>
-    <w:p>
-      <w:pPr>
-        <w:pStyle w:val="Heading2"/>
-      </w:pPr>
-      <w:r>
-        <w:t>Contribution scope</w:t>
-      </w:r>
-    </w:p>
-    <w:tbl>
-      <w:tblPr>
-        <w:tblW w:type="auto" w:w="0"/>
-        <w:jc w:val="center"/>
-        <w:tblLayout w:type="fixed"/>
-        <w:tblLook w:firstColumn="1" w:firstRow="1" w:lastColumn="0" w:lastRow="0" w:noHBand="0" w:noVBand="1" w:val="04A0"/>
-      </w:tblPr>
-      <w:tblGrid>
-        <w:gridCol w:w="3456"/>
-        <w:gridCol w:w="6768"/>
-      </w:tblGrid>
-      <w:tr>
-        <w:trPr>
-          <w:cantSplit/>
-          <w:tblHeader/>
-        </w:trPr>
-        <w:tc>
-          <w:tcPr>
-            <w:tcW w:type="dxa" w:w="3456"/>
-            <w:vAlign w:val="center"/>
-            <w:shd w:fill="203C50"/>
-            <w:tcBorders>
-              <w:top w:val="single" w:sz="4" w:color="D9D9D9"/>
-              <w:left w:val="single" w:sz="4" w:color="D9D9D9"/>
-              <w:bottom w:val="single" w:sz="4" w:color="D9D9D9"/>
-              <w:right w:val="single" w:sz="4" w:color="D9D9D9"/>
-            </w:tcBorders>
-            <w:tcMar>
-              <w:top w:w="80" w:type="dxa"/>
-              <w:left w:w="80" w:type="dxa"/>
-              <w:bottom w:w="80" w:type="dxa"/>
-              <w:right w:w="80" w:type="dxa"/>
-            </w:tcMar>
-          </w:tcPr>
-          <w:p>
-            <w:pPr>
-              <w:keepNext/>
-              <w:spacing w:after="20" w:before="20" w:line="245" w:lineRule="auto"/>
-              <w:jc w:val="center"/>
-            </w:pPr>
-            <w:r>
-              <w:rPr>
-                <w:b/>
-                <w:color w:val="FFFFFF"/>
-                <w:sz w:val="20"/>
-              </w:rPr>
-              <w:t>Final report chapter</w:t>
-            </w:r>
-          </w:p>
-        </w:tc>
-        <w:tc>
-          <w:tcPr>
-            <w:tcW w:type="dxa" w:w="6768"/>
-            <w:vAlign w:val="center"/>
-            <w:shd w:fill="203C50"/>
-            <w:tcBorders>
-              <w:top w:val="single" w:sz="4" w:color="D9D9D9"/>
-              <w:left w:val="single" w:sz="4" w:color="D9D9D9"/>
-              <w:bottom w:val="single" w:sz="4" w:color="D9D9D9"/>
-              <w:right w:val="single" w:sz="4" w:color="D9D9D9"/>
-            </w:tcBorders>
-            <w:tcMar>
-              <w:top w:w="80" w:type="dxa"/>
-              <w:left w:w="80" w:type="dxa"/>
-              <w:bottom w:w="80" w:type="dxa"/>
-              <w:right w:w="80" w:type="dxa"/>
-            </w:tcMar>
-          </w:tcPr>
-          <w:p>
-            <w:pPr>
-              <w:keepNext/>
-              <w:spacing w:after="20" w:before="20" w:line="245" w:lineRule="auto"/>
-              <w:jc w:val="center"/>
-            </w:pPr>
-            <w:r>
-              <w:rPr>
-                <w:b/>
-                <w:color w:val="FFFFFF"/>
-                <w:sz w:val="20"/>
-              </w:rPr>
-              <w:t>Minh contribution</w:t>
-            </w:r>
-          </w:p>
-        </w:tc>
-      </w:tr>
-      <w:tr>
-        <w:trPr>
-          <w:cantSplit/>
-        </w:trPr>
-        <w:tc>
-          <w:tcPr>
-            <w:tcW w:type="dxa" w:w="3456"/>
-            <w:vAlign w:val="center"/>
-            <w:shd w:fill="FFFFFF"/>
-            <w:tcBorders>
-              <w:top w:val="single" w:sz="4" w:color="D9D9D9"/>
-              <w:left w:val="single" w:sz="4" w:color="D9D9D9"/>
-              <w:bottom w:val="single" w:sz="4" w:color="D9D9D9"/>
-              <w:right w:val="single" w:sz="4" w:color="D9D9D9"/>
-            </w:tcBorders>
-            <w:tcMar>
-              <w:top w:w="80" w:type="dxa"/>
-              <w:left w:w="80" w:type="dxa"/>
-              <w:bottom w:w="80" w:type="dxa"/>
-              <w:right w:w="80" w:type="dxa"/>
-            </w:tcMar>
-          </w:tcPr>
-          <w:p>
-            <w:pPr>
-              <w:keepNext/>
-              <w:spacing w:after="20" w:before="20" w:line="245" w:lineRule="auto"/>
-            </w:pPr>
-            <w:r>
-              <w:rPr>
-                <w:b w:val="0"/>
-                <w:color w:val="000000"/>
-                <w:sz w:val="20"/>
-              </w:rPr>
-              <w:t>5 System Architecture</w:t>
-            </w:r>
-          </w:p>
-        </w:tc>
-        <w:tc>
-          <w:tcPr>
-            <w:tcW w:type="dxa" w:w="6768"/>
-            <w:vAlign w:val="center"/>
-            <w:shd w:fill="FFFFFF"/>
-            <w:tcBorders>
-              <w:top w:val="single" w:sz="4" w:color="D9D9D9"/>
-              <w:left w:val="single" w:sz="4" w:color="D9D9D9"/>
-              <w:bottom w:val="single" w:sz="4" w:color="D9D9D9"/>
-              <w:right w:val="single" w:sz="4" w:color="D9D9D9"/>
-            </w:tcBorders>
-            <w:tcMar>
-              <w:top w:w="80" w:type="dxa"/>
-              <w:left w:w="80" w:type="dxa"/>
-              <w:bottom w:w="80" w:type="dxa"/>
-              <w:right w:w="80" w:type="dxa"/>
-            </w:tcMar>
-          </w:tcPr>
-          <w:p>
-            <w:pPr>
-              <w:keepNext/>
-              <w:spacing w:after="20" w:before="20" w:line="245" w:lineRule="auto"/>
-            </w:pPr>
-            <w:r>
-              <w:rPr>
-                <w:b w:val="0"/>
-                <w:color w:val="000000"/>
-                <w:sz w:val="20"/>
-              </w:rPr>
-              <w:t>Shared architecture contribution covering persistence, service boundaries and deployment topology.</w:t>
-            </w:r>
-          </w:p>
-        </w:tc>
-      </w:tr>
-      <w:tr>
-        <w:trPr>
-          <w:cantSplit/>
-        </w:trPr>
-        <w:tc>
-          <w:tcPr>
-            <w:tcW w:type="dxa" w:w="3456"/>
-            <w:vAlign w:val="center"/>
-            <w:shd w:fill="F1F5F8"/>
-            <w:tcBorders>
-              <w:top w:val="single" w:sz="4" w:color="D9D9D9"/>
-              <w:left w:val="single" w:sz="4" w:color="D9D9D9"/>
-              <w:bottom w:val="single" w:sz="4" w:color="D9D9D9"/>
-              <w:right w:val="single" w:sz="4" w:color="D9D9D9"/>
-            </w:tcBorders>
-            <w:tcMar>
-              <w:top w:w="80" w:type="dxa"/>
-              <w:left w:w="80" w:type="dxa"/>
-              <w:bottom w:w="80" w:type="dxa"/>
-              <w:right w:w="80" w:type="dxa"/>
-            </w:tcMar>
-          </w:tcPr>
-          <w:p>
-            <w:pPr>
-              <w:spacing w:after="20" w:before="20" w:line="245" w:lineRule="auto"/>
-            </w:pPr>
-            <w:r>
-              <w:rPr>
-                <w:b w:val="0"/>
-                <w:color w:val="000000"/>
-                <w:sz w:val="20"/>
-              </w:rPr>
-              <w:t>8 Database and Data Dictionary</w:t>
-            </w:r>
-          </w:p>
-        </w:tc>
-        <w:tc>
-          <w:tcPr>
-            <w:tcW w:type="dxa" w:w="6768"/>
-            <w:vAlign w:val="center"/>
-            <w:shd w:fill="F1F5F8"/>
-            <w:tcBorders>
-              <w:top w:val="single" w:sz="4" w:color="D9D9D9"/>
-              <w:left w:val="single" w:sz="4" w:color="D9D9D9"/>
-              <w:bottom w:val="single" w:sz="4" w:color="D9D9D9"/>
-              <w:right w:val="single" w:sz="4" w:color="D9D9D9"/>
-            </w:tcBorders>
-            <w:tcMar>
-              <w:top w:w="80" w:type="dxa"/>
-              <w:left w:w="80" w:type="dxa"/>
-              <w:bottom w:w="80" w:type="dxa"/>
-              <w:right w:w="80" w:type="dxa"/>
-            </w:tcMar>
-          </w:tcPr>
-          <w:p>
-            <w:pPr>
-              <w:spacing w:after="20" w:before="20" w:line="245" w:lineRule="auto"/>
-            </w:pPr>
-            <w:r>
-              <w:rPr>
-                <w:b w:val="0"/>
-                <w:color w:val="000000"/>
-                <w:sz w:val="20"/>
-              </w:rPr>
-              <w:t>Database structure, relationships, field definitions, constraints, migrations and demonstration data.</w:t>
-            </w:r>
-          </w:p>
-        </w:tc>
-      </w:tr>
-      <w:tr>
-        <w:trPr>
-          <w:cantSplit/>
-        </w:trPr>
-        <w:tc>
-          <w:tcPr>
-            <w:tcW w:type="dxa" w:w="3456"/>
-            <w:vAlign w:val="center"/>
-            <w:shd w:fill="FFFFFF"/>
-            <w:tcBorders>
-              <w:top w:val="single" w:sz="4" w:color="D9D9D9"/>
-              <w:left w:val="single" w:sz="4" w:color="D9D9D9"/>
-              <w:bottom w:val="single" w:sz="4" w:color="D9D9D9"/>
-              <w:right w:val="single" w:sz="4" w:color="D9D9D9"/>
-            </w:tcBorders>
-            <w:tcMar>
-              <w:top w:w="80" w:type="dxa"/>
-              <w:left w:w="80" w:type="dxa"/>
-              <w:bottom w:w="80" w:type="dxa"/>
-              <w:right w:w="80" w:type="dxa"/>
-            </w:tcMar>
-          </w:tcPr>
-          <w:p>
-            <w:pPr>
-              <w:spacing w:after="20" w:before="20" w:line="245" w:lineRule="auto"/>
-            </w:pPr>
-            <w:r>
-              <w:rPr>
-                <w:b w:val="0"/>
-                <w:color w:val="000000"/>
-                <w:sz w:val="20"/>
-              </w:rPr>
-              <w:t>9 Security and Data Handling</w:t>
-            </w:r>
-          </w:p>
-        </w:tc>
-        <w:tc>
-          <w:tcPr>
-            <w:tcW w:type="dxa" w:w="6768"/>
-            <w:vAlign w:val="center"/>
-            <w:shd w:fill="FFFFFF"/>
-            <w:tcBorders>
-              <w:top w:val="single" w:sz="4" w:color="D9D9D9"/>
-              <w:left w:val="single" w:sz="4" w:color="D9D9D9"/>
-              <w:bottom w:val="single" w:sz="4" w:color="D9D9D9"/>
-              <w:right w:val="single" w:sz="4" w:color="D9D9D9"/>
-            </w:tcBorders>
-            <w:tcMar>
-              <w:top w:w="80" w:type="dxa"/>
-              <w:left w:w="80" w:type="dxa"/>
-              <w:bottom w:w="80" w:type="dxa"/>
-              <w:right w:w="80" w:type="dxa"/>
-            </w:tcMar>
-          </w:tcPr>
-          <w:p>
-            <w:pPr>
-              <w:spacing w:after="20" w:before="20" w:line="245" w:lineRule="auto"/>
-            </w:pPr>
-            <w:r>
-              <w:rPr>
-                <w:b w:val="0"/>
-                <w:color w:val="000000"/>
-                <w:sz w:val="20"/>
-              </w:rPr>
-              <w:t>Shared contribution covering data ownership, storage, deletion, uploads, secrets and recovery.</w:t>
-            </w:r>
-          </w:p>
-        </w:tc>
-      </w:tr>
-      <w:tr>
-        <w:trPr>
-          <w:cantSplit/>
-        </w:trPr>
-        <w:tc>
-          <w:tcPr>
-            <w:tcW w:type="dxa" w:w="3456"/>
-            <w:vAlign w:val="center"/>
-            <w:shd w:fill="F1F5F8"/>
-            <w:tcBorders>
-              <w:top w:val="single" w:sz="4" w:color="D9D9D9"/>
-              <w:left w:val="single" w:sz="4" w:color="D9D9D9"/>
-              <w:bottom w:val="single" w:sz="4" w:color="D9D9D9"/>
-              <w:right w:val="single" w:sz="4" w:color="D9D9D9"/>
-            </w:tcBorders>
-            <w:tcMar>
-              <w:top w:w="80" w:type="dxa"/>
-              <w:left w:w="80" w:type="dxa"/>
-              <w:bottom w:w="80" w:type="dxa"/>
-              <w:right w:w="80" w:type="dxa"/>
-            </w:tcMar>
-          </w:tcPr>
-          <w:p>
-            <w:pPr>
-              <w:spacing w:after="20" w:before="20" w:line="245" w:lineRule="auto"/>
-            </w:pPr>
-            <w:r>
-              <w:rPr>
-                <w:b w:val="0"/>
-                <w:color w:val="000000"/>
-                <w:sz w:val="20"/>
-              </w:rPr>
-              <w:t>11 Installation Deployment and Maintenance</w:t>
-            </w:r>
-          </w:p>
-        </w:tc>
-        <w:tc>
-          <w:tcPr>
-            <w:tcW w:type="dxa" w:w="6768"/>
-            <w:vAlign w:val="center"/>
-            <w:shd w:fill="F1F5F8"/>
-            <w:tcBorders>
-              <w:top w:val="single" w:sz="4" w:color="D9D9D9"/>
-              <w:left w:val="single" w:sz="4" w:color="D9D9D9"/>
-              <w:bottom w:val="single" w:sz="4" w:color="D9D9D9"/>
-              <w:right w:val="single" w:sz="4" w:color="D9D9D9"/>
-            </w:tcBorders>
-            <w:tcMar>
-              <w:top w:w="80" w:type="dxa"/>
-              <w:left w:w="80" w:type="dxa"/>
-              <w:bottom w:w="80" w:type="dxa"/>
-              <w:right w:w="80" w:type="dxa"/>
-            </w:tcMar>
-          </w:tcPr>
-          <w:p>
-            <w:pPr>
-              <w:spacing w:after="20" w:before="20" w:line="245" w:lineRule="auto"/>
-            </w:pPr>
-            <w:r>
-              <w:rPr>
-                <w:b w:val="0"/>
-                <w:color w:val="000000"/>
-                <w:sz w:val="20"/>
-              </w:rPr>
-              <w:t>Installation runbook, operational limitations, maintenance and source handover.</w:t>
-            </w:r>
-          </w:p>
-        </w:tc>
-      </w:tr>
-    </w:tbl>
-    <w:p>
-      <w:pPr>
-        <w:spacing w:after="60" w:line="60" w:lineRule="exact"/>
-      </w:pPr>
-    </w:p>
-    <w:p>
-      <w:r>
-        <w:t>The chapter numbers follow the final A5 report. Chapter 6 Frontend and UI UX Design belongs to Anh Minh and Vinh and is outside this contribution. Shared chapters should be combined with Duy and the other architecture contributors before the complete report is submitted.</w:t>
-      </w:r>
-    </w:p>
-    <w:p>
-      <w:r>
         <w:rPr>
-          <w:sz w:val="19"/>
+          <w:color w:val="000000"/>
         </w:rPr>
-        <w:t>Implementation baseline: develop working tree based on commit 86a507f, including local changes. A release identifier should be recorded after the team freezes and validates the final submission.</w:t>
-      </w:r>
-    </w:p>
-    <w:p>
-      <w:r>
-        <w:br w:type="page"/>
-      </w:r>
-    </w:p>
-    <w:p>
-      <w:pPr>
-        <w:pStyle w:val="Heading1"/>
-      </w:pPr>
-      <w:r>
         <w:t>5 System Architecture</w:t>
       </w:r>
     </w:p>
     <w:p>
       <w:pPr>
         <w:pStyle w:val="Heading2"/>
+        <w:keepNext/>
       </w:pPr>
       <w:r>
+        <w:rPr>
+          <w:color w:val="000000"/>
+        </w:rPr>
         <w:t>5 1 Architecture overview</w:t>
       </w:r>
     </w:p>
     <w:p>
+      <w:pPr>
+        <w:jc w:val="left"/>
+      </w:pPr>
       <w:r>
-        <w:t>The application uses a browser frontend, an API service and a relational database. Next.js supplies the web interface, while FastAPI authenticates requests and runs task, scheduling, notification, analytics, focus and gamification services. SQLAlchemy maps domain records to PostgreSQL, and Alembic controls changes to the schema. The browser does not connect directly to PostgreSQL.</w:t>
+        <w:t>Chrono combines task management, scheduling, focus sessions, productivity insights, and Personal Forest progress in one web application. Its architecture has three main parts: a responsive browser interface built with Next.js, a FastAPI service that applies application rules, and a PostgreSQL database that stores account and activity records. This separation allows desktop and mobile users to use the same services and records through layouts suited to their screens.</w:t>
       </w:r>
     </w:p>
     <w:p>
       <w:pPr>
         <w:keepNext/>
+        <w:keepLines/>
         <w:jc w:val="center"/>
       </w:pPr>
       <w:r>
@@ -513,62 +84,131 @@
       </w:r>
     </w:p>
     <w:p>
+      <w:pPr>
+        <w:jc w:val="left"/>
+      </w:pPr>
       <w:r>
-        <w:t>The frontend sends JSON requests to the API address configured by NEXT_PUBLIC_API_URL and adds the current access token as a Bearer credential. API routes resolve the user before accessing that user's records. The database is the authoritative store; local browser caches and session state support interface behaviour but do not replace persisted records. [R2, R3, R4]</w:t>
+        <w:t>The browser sends requests to the API, which authenticates the user and checks access before reading or changing personal records. PostgreSQL holds the saved application state. Temporary browser data supports the interface during navigation, while the API remains responsible for validation and ownership. The browser has no direct database connection. [R1, R2, R3]</w:t>
       </w:r>
     </w:p>
     <w:p>
       <w:pPr>
         <w:pStyle w:val="Heading2"/>
+        <w:keepNext/>
       </w:pPr>
       <w:r>
+        <w:rPr>
+          <w:color w:val="000000"/>
+        </w:rPr>
         <w:t>5 2 Persistence and feature boundaries</w:t>
       </w:r>
     </w:p>
     <w:p>
+      <w:pPr>
+        <w:jc w:val="left"/>
+      </w:pPr>
       <w:r>
-        <w:t>The API modules separate identity, projects, tasks, settings, focus, notifications, scheduling, analytics and gamification. Their tables share one SQLAlchemy metadata collection and one PostgreSQL database. This is a modular backend within a single application, rather than a set of independently deployed microservices. The folders API delegates to the project service, so the interface label Folder does not introduce a separate folders table.</w:t>
+        <w:t>The backend groups related behaviour into identity, projects, tasks, settings, focus, notifications, scheduling, analytics, and gamification modules. These modules form one application and share one PostgreSQL database. Their separation keeps each feature’s rules identifiable while allowing tasks, focus effort, and rewards to work together. Folders in the interface correspond to project records rather than a second collection of folders.</w:t>
       </w:r>
     </w:p>
     <w:p>
+      <w:pPr>
+        <w:jc w:val="left"/>
+      </w:pPr>
       <w:r>
-        <w:t>Calendar views use task deadlines and scheduled intervals. The dashboard combines current task and focus information through GET /dashboard/summary. Weekly AI insights store a metrics snapshot and generated narrative, but the dashboard is not maintained as a separate dashboard table. Avatar files are stored outside PostgreSQL; only their paths are saved in users.avatar_path. [R3, R5, R6]</w:t>
+        <w:t>Calendar views present task deadlines and scheduled intervals. The dashboard brings task progress, focus activity, recommendations, and other summaries into one response. Weekly insights retain the metrics and narrative associated with a reporting period. Profile images are stored as files outside PostgreSQL, with their locations recorded in the user profile. [R2, R4, R5]</w:t>
       </w:r>
     </w:p>
     <w:p>
       <w:pPr>
         <w:pStyle w:val="Heading2"/>
+        <w:keepNext/>
       </w:pPr>
       <w:r>
-        <w:t>5 3 Request and transaction lifecycle</w:t>
+        <w:rPr>
+          <w:color w:val="000000"/>
+        </w:rPr>
+        <w:t>5 3 Processing a user action</w:t>
       </w:r>
     </w:p>
     <w:p>
+      <w:pPr>
+        <w:jc w:val="left"/>
+      </w:pPr>
       <w:r>
-        <w:t>A task creation request passes through schema validation, authentication and service-level checks before the service adds the task to the database. The task service also coordinates notifications and schedule revision changes. After a successful commit, the API returns the saved record and the frontend refreshes affected views. Invalid input should be rejected before persistence, and a reference to another user's project must not be accepted.</w:t>
+        <w:t>When a person creates a task, the API validates its fields, identifies the account, and checks any selected project before saving it. The task service also coordinates related notifications and schedule revisions. Once the change is saved, the API returns the task and the interface updates the affected views. This keeps a task’s displayed state connected to its saved state.</w:t>
       </w:r>
     </w:p>
     <w:p>
+      <w:pPr>
+        <w:jc w:val="left"/>
+      </w:pPr>
       <w:r>
-        <w:t>The database dependency opens a SQLAlchemy session for the request and closes it afterwards. Services explicitly commit their changes; the session dependency does not automatically commit every successful HTTP request. Some related work uses separate transactions, including AI generation telemetry. Consequently, the application must not be described as making every request and every side effect one atomic transaction. The engine uses pool_pre_ping to check connections before reuse. [R4, R6, R8]</w:t>
+        <w:t>Each request uses a database session that closes after processing. Services commit their own changes, and some supporting activity, such as AI generation telemetry, uses a separate transaction. Related actions therefore do not always form one indivisible database operation. Connections are checked before reuse to reduce failures caused by disconnected database sessions. [R3, R5, R7]</w:t>
       </w:r>
     </w:p>
     <w:p>
       <w:pPr>
         <w:pStyle w:val="Heading2"/>
+        <w:keepNext/>
       </w:pPr>
       <w:r>
-        <w:t>5 4 Deployment boundary</w:t>
+        <w:rPr>
+          <w:color w:val="000000"/>
+        </w:rPr>
+        <w:t>5 4 Data delivery and responsiveness</w:t>
       </w:r>
     </w:p>
     <w:p>
+      <w:pPr>
+        <w:jc w:val="left"/>
+      </w:pPr>
       <w:r>
-        <w:t>The supplied Compose configuration starts PostgreSQL, FastAPI and the web application. PostgreSQL has a health check, and the API waits for it before running migrations and starting Uvicorn. The web service has a start-order dependency on the API, but no equivalent API readiness condition. The current API command enables reload and mounts source directories, which makes this configuration suitable for development and demonstrations rather than a completed production deployment. [R10]</w:t>
+        <w:t>The dashboard retrieves a combined summary rather than assembling each card through a separate feature request. Tasks retrieves its rows, one status-count summary, and project choices. The status counts use one account-scoped aggregate query in place of five separate task-list requests. A cold Tasks visit therefore uses three feature reads rather than seven; shared navigation and header requests are additional. [R1, R5]</w:t>
       </w:r>
     </w:p>
     <w:p>
+      <w:pPr>
+        <w:jc w:val="left"/>
+      </w:pPr>
       <w:r>
-        <w:t>Optional Gemini calls originate from the API. Provider credentials must remain server-side. PostgreSQL and uploaded avatar files have different backup requirements, and the current Compose configuration persists only PostgreSQL. These boundaries affect both recovery and the source handover described in Chapter 11.</w:t>
+        <w:t>A bounded browser-memory cache shares eligible task and project reads during navigation. It can reuse recent results and combine matching requests already in progress. Task and project changes invalidate affected entries, and changes to authentication clear cached data. This reduces repeated retrieval while the API continues to authenticate network requests and PostgreSQL remains the source of saved records.</w:t>
+      </w:r>
+    </w:p>
+    <w:p>
+      <w:pPr>
+        <w:jc w:val="left"/>
+      </w:pPr>
+      <w:r>
+        <w:t>These changes affect data retrieval and request coordination. They introduce no new database tables, columns, or schema migration, and they do not provide continuous synchronisation between browser tabs or devices. Their effect on navigation time needs to be measured in the deployed environment.</w:t>
+      </w:r>
+    </w:p>
+    <w:p>
+      <w:pPr>
+        <w:pStyle w:val="Heading2"/>
+        <w:keepNext/>
+      </w:pPr>
+      <w:r>
+        <w:rPr>
+          <w:color w:val="000000"/>
+        </w:rPr>
+        <w:t>5 5 Deployment design</w:t>
+      </w:r>
+    </w:p>
+    <w:p>
+      <w:pPr>
+        <w:jc w:val="left"/>
+      </w:pPr>
+      <w:r>
+        <w:t>The demonstration configuration runs the web interface, API, and PostgreSQL as separate Docker Compose services. A database health check runs before the API starts; the API then applies schema migrations and launches the service. The web service depends on API startup, although that dependency does not itself verify that every API function is ready. The supplied configuration includes development reload and source mounts. Chapter 11 explains this deployment boundary and the requirements for a public installation. [R9]</w:t>
+      </w:r>
+    </w:p>
+    <w:p>
+      <w:pPr>
+        <w:jc w:val="left"/>
+      </w:pPr>
+      <w:r>
+        <w:t>Optional Gemini processing is requested by the API, keeping provider credentials outside the browser. Database records and uploaded profile images use separate storage, so recovery must cover both. The current Compose configuration provides persistent database storage; durable storage for uploaded images requires additional configuration.</w:t>
       </w:r>
     </w:p>
     <w:p>
@@ -579,22 +219,33 @@
     <w:p>
       <w:pPr>
         <w:pStyle w:val="Heading1"/>
+        <w:keepNext/>
       </w:pPr>
       <w:r>
+        <w:rPr>
+          <w:color w:val="000000"/>
+        </w:rPr>
         <w:t>8 Database and Data Dictionary</w:t>
       </w:r>
     </w:p>
     <w:p>
       <w:pPr>
         <w:pStyle w:val="Heading2"/>
+        <w:keepNext/>
       </w:pPr>
       <w:r>
+        <w:rPr>
+          <w:color w:val="000000"/>
+        </w:rPr>
         <w:t>8 1 Database organisation</w:t>
       </w:r>
     </w:p>
     <w:p>
+      <w:pPr>
+        <w:jc w:val="left"/>
+      </w:pPr>
       <w:r>
-        <w:t>The current ORM defines 22 application tables. PostgreSQL additionally stores Alembic revision bookkeeping in alembic_version. UUID keys identify most user-owned records, while plant species and achievement catalogues use stable string identifiers. Relational columns represent ownership and core associations; JSON and JSONB fields store structured recommendation, proposal and metrics payloads whose shapes vary by feature. [R4, R5, R6, R7, R8]</w:t>
+        <w:t>Chrono stores its application data in 22 tables, with a separate Alembic record tracking the installed schema revision. Account ownership and relationships use relational keys. Flexible recommendation details, schedule proposals, and reporting snapshots use JSON or JSONB where the shape varies by feature. Most personal records use UUID identifiers, while plant species and achievement catalogues use stable text codes. [R3, R4, R5, R6, R7]</w:t>
       </w:r>
     </w:p>
     <w:tbl>
@@ -1335,14 +986,19 @@
     <w:p>
       <w:pPr>
         <w:pStyle w:val="Heading2"/>
+        <w:keepNext/>
       </w:pPr>
       <w:r>
+        <w:rPr>
+          <w:color w:val="000000"/>
+        </w:rPr>
         <w:t>8 2 Entity relationships</w:t>
       </w:r>
     </w:p>
     <w:p>
       <w:pPr>
         <w:keepNext/>
+        <w:keepLines/>
         <w:jc w:val="center"/>
       </w:pPr>
       <w:r>
@@ -1389,8 +1045,11 @@
       </w:r>
     </w:p>
     <w:p>
+      <w:pPr>
+        <w:jc w:val="left"/>
+      </w:pPr>
       <w:r>
-        <w:t>A user owns many projects and tasks. A task may belong to one project or have no project, which represents Inbox. A task has many subtasks. A focus session keeps an optional primary task reference and can also link to several tasks through focus_session_tasks. Settings, schedule revision state and the gamification profile are user-specific singleton records, enforced by a unique user reference or a user primary key.</w:t>
+        <w:t>A user owns projects and tasks. Each task can belong to one project or remain unassigned in Inbox, and can contain several subtasks. Focus sessions may identify a primary task and can link to additional tasks through a junction table. Each account also has its own settings, schedule revision state, and gamification profile. These relationships connect planning, recorded effort, and progress without combining them into a single record.</w:t>
       </w:r>
     </w:p>
     <w:tbl>
@@ -2432,39 +2091,57 @@
       </w:pPr>
     </w:p>
     <w:p>
+      <w:pPr>
+        <w:jc w:val="left"/>
+      </w:pPr>
       <w:r>
-        <w:t>These are database deletion behaviours, not a claim that an account-deletion screen exists. A database cascade cannot remove avatar files from the filesystem. References stored inside JSON snapshots, reward_events.source_id and reschedule_proposals.selected_option_id do not have the same foreign-key enforcement as relational references.</w:t>
+        <w:t>These deletion rules describe how stored records relate when a parent record is removed. Removing a project preserves its tasks by returning them to Inbox. Database rules do not remove profile-image files, and references held inside JSON snapshots do not receive the same foreign-key checks as relational columns.</w:t>
       </w:r>
     </w:p>
     <w:p>
       <w:pPr>
         <w:pStyle w:val="Heading2"/>
+        <w:keepNext/>
       </w:pPr>
       <w:r>
+        <w:rPr>
+          <w:color w:val="000000"/>
+        </w:rPr>
         <w:t>8 3 Dictionary conventions</w:t>
       </w:r>
     </w:p>
     <w:p>
+      <w:pPr>
+        <w:jc w:val="left"/>
+      </w:pPr>
       <w:r>
-        <w:t>The following dictionary covers every application table. PK means primary key, FK means foreign key and NULL means an optional value. TIMESTAMPTZ denotes a timezone-aware timestamp. Unless an exception is stated, id is a non-null UUID primary key generated by the application with uuid4; user_id is a non-null UUID FK to users.id with CASCADE deletion. Creation and update timestamps are non-null and initially use the database current time; updated_at is refreshed by ORM-managed updates, not by a universal database trigger.</w:t>
+        <w:t>The data dictionary defines all application tables. PK denotes a primary key, FK a foreign key, and NULL an optional value. TIMESTAMPTZ is a timestamp with timezone support. Unless stated otherwise, id is an application-generated UUID and user_id is a required reference to the owning account. Creation and update timestamps are required; updates made through the application refresh updated_at.</w:t>
       </w:r>
     </w:p>
     <w:p>
+      <w:pPr>
+        <w:jc w:val="left"/>
+      </w:pPr>
       <w:r>
-        <w:t>Defaults below describe the model or service contract. An ORM default applies when SQLAlchemy inserts a row and is not automatically a PostgreSQL server default. Raw SQL loaders must supply fields without a server default. Grouped fields retain their exact names and use the same type and nullability unless the description states otherwise. The migration history must also be consulted because it contains constraints that are not repeated in every ORM model. [R4, R9]</w:t>
+        <w:t>Defaults describe values supplied by the model or service. An application default is distinct from a database default, so direct database inserts may need to supply additional fields. Grouped field names share the stated type and nullability unless a row specifies an exception. Schema migrations also define constraints used by the installed database. [R3, R8]</w:t>
       </w:r>
     </w:p>
     <w:p>
       <w:pPr>
         <w:pStyle w:val="Heading3"/>
+        <w:keepNext/>
       </w:pPr>
       <w:r>
+        <w:rPr>
+          <w:color w:val="000000"/>
+        </w:rPr>
         <w:t>8 3 1 users</w:t>
       </w:r>
     </w:p>
     <w:p>
       <w:pPr>
         <w:keepNext/>
+        <w:jc w:val="left"/>
       </w:pPr>
       <w:r>
         <w:t>Account identity and authentication data.</w:t>
@@ -3702,14 +3379,19 @@
     <w:p>
       <w:pPr>
         <w:pStyle w:val="Heading3"/>
+        <w:keepNext/>
       </w:pPr>
       <w:r>
+        <w:rPr>
+          <w:color w:val="000000"/>
+        </w:rPr>
         <w:t>8 3 2 projects</w:t>
       </w:r>
     </w:p>
     <w:p>
       <w:pPr>
         <w:keepNext/>
+        <w:jc w:val="left"/>
       </w:pPr>
       <w:r>
         <w:t>Project records presented as folders in the interface.</w:t>
@@ -4415,14 +4097,19 @@
     <w:p>
       <w:pPr>
         <w:pStyle w:val="Heading3"/>
+        <w:keepNext/>
       </w:pPr>
       <w:r>
+        <w:rPr>
+          <w:color w:val="000000"/>
+        </w:rPr>
         <w:t>8 3 3 tasks</w:t>
       </w:r>
     </w:p>
     <w:p>
       <w:pPr>
         <w:keepNext/>
+        <w:jc w:val="left"/>
       </w:pPr>
       <w:r>
         <w:t>Primary task state and scheduling fields.</w:t>
@@ -6192,14 +5879,19 @@
     <w:p>
       <w:pPr>
         <w:pStyle w:val="Heading3"/>
+        <w:keepNext/>
       </w:pPr>
       <w:r>
+        <w:rPr>
+          <w:color w:val="000000"/>
+        </w:rPr>
         <w:t>8 3 4 subtasks</w:t>
       </w:r>
     </w:p>
     <w:p>
       <w:pPr>
         <w:keepNext/>
+        <w:jc w:val="left"/>
       </w:pPr>
       <w:r>
         <w:t>Ordered checklist entries belonging to one task.</w:t>
@@ -7171,14 +6863,19 @@
     <w:p>
       <w:pPr>
         <w:pStyle w:val="Heading3"/>
+        <w:keepNext/>
       </w:pPr>
       <w:r>
+        <w:rPr>
+          <w:color w:val="000000"/>
+        </w:rPr>
         <w:t>8 3 5 user settings</w:t>
       </w:r>
     </w:p>
     <w:p>
       <w:pPr>
         <w:keepNext/>
+        <w:jc w:val="left"/>
       </w:pPr>
       <w:r>
         <w:t>One settings record per user.</w:t>
@@ -9081,14 +8778,19 @@
     <w:p>
       <w:pPr>
         <w:pStyle w:val="Heading3"/>
+        <w:keepNext/>
       </w:pPr>
       <w:r>
+        <w:rPr>
+          <w:color w:val="000000"/>
+        </w:rPr>
         <w:t>8 3 6 notifications</w:t>
       </w:r>
     </w:p>
     <w:p>
       <w:pPr>
         <w:keepNext/>
+        <w:jc w:val="left"/>
       </w:pPr>
       <w:r>
         <w:t>In-app messages and reminder state.</w:t>
@@ -10459,14 +10161,19 @@
     <w:p>
       <w:pPr>
         <w:pStyle w:val="Heading3"/>
+        <w:keepNext/>
       </w:pPr>
       <w:r>
+        <w:rPr>
+          <w:color w:val="000000"/>
+        </w:rPr>
         <w:t>8 3 7 focus sessions</w:t>
       </w:r>
     </w:p>
     <w:p>
       <w:pPr>
         <w:keepNext/>
+        <w:jc w:val="left"/>
       </w:pPr>
       <w:r>
         <w:t>Persisted focus timer lifecycle and effort.</w:t>
@@ -11837,14 +11544,19 @@
     <w:p>
       <w:pPr>
         <w:pStyle w:val="Heading3"/>
+        <w:keepNext/>
       </w:pPr>
       <w:r>
+        <w:rPr>
+          <w:color w:val="000000"/>
+        </w:rPr>
         <w:t>8 3 8 focus session tasks</w:t>
       </w:r>
     </w:p>
     <w:p>
       <w:pPr>
         <w:keepNext/>
+        <w:jc w:val="left"/>
       </w:pPr>
       <w:r>
         <w:t>Many to many link between sessions and tasks.</w:t>
@@ -12284,14 +11996,19 @@
     <w:p>
       <w:pPr>
         <w:pStyle w:val="Heading3"/>
+        <w:keepNext/>
       </w:pPr>
       <w:r>
+        <w:rPr>
+          <w:color w:val="000000"/>
+        </w:rPr>
         <w:t>8 3 9 user schedule states</w:t>
       </w:r>
     </w:p>
     <w:p>
       <w:pPr>
         <w:keepNext/>
+        <w:jc w:val="left"/>
       </w:pPr>
       <w:r>
         <w:t>Per-user scheduling revision counter.</w:t>
@@ -12864,14 +12581,19 @@
     <w:p>
       <w:pPr>
         <w:pStyle w:val="Heading3"/>
+        <w:keepNext/>
       </w:pPr>
       <w:r>
+        <w:rPr>
+          <w:color w:val="000000"/>
+        </w:rPr>
         <w:t>8 3 10 ai recommendations</w:t>
       </w:r>
     </w:p>
     <w:p>
       <w:pPr>
         <w:keepNext/>
+        <w:jc w:val="left"/>
       </w:pPr>
       <w:r>
         <w:t>Saved recommendation explanation and ranking.</w:t>
@@ -14242,14 +13964,19 @@
     <w:p>
       <w:pPr>
         <w:pStyle w:val="Heading3"/>
+        <w:keepNext/>
       </w:pPr>
       <w:r>
+        <w:rPr>
+          <w:color w:val="000000"/>
+        </w:rPr>
         <w:t>8 3 11 ai schedule suggestions</w:t>
       </w:r>
     </w:p>
     <w:p>
       <w:pPr>
         <w:keepNext/>
+        <w:jc w:val="left"/>
       </w:pPr>
       <w:r>
         <w:t>Candidate intervals for individual tasks.</w:t>
@@ -15487,14 +15214,19 @@
     <w:p>
       <w:pPr>
         <w:pStyle w:val="Heading3"/>
+        <w:keepNext/>
       </w:pPr>
       <w:r>
+        <w:rPr>
+          <w:color w:val="000000"/>
+        </w:rPr>
         <w:t>8 3 12 reschedule proposals</w:t>
       </w:r>
     </w:p>
     <w:p>
       <w:pPr>
         <w:keepNext/>
+        <w:jc w:val="left"/>
       </w:pPr>
       <w:r>
         <w:t>Preview state and reversible rescheduling records.</w:t>
@@ -16998,14 +16730,19 @@
     <w:p>
       <w:pPr>
         <w:pStyle w:val="Heading3"/>
+        <w:keepNext/>
       </w:pPr>
       <w:r>
+        <w:rPr>
+          <w:color w:val="000000"/>
+        </w:rPr>
         <w:t>8 3 13 duration estimate decisions</w:t>
       </w:r>
     </w:p>
     <w:p>
       <w:pPr>
         <w:keepNext/>
+        <w:jc w:val="left"/>
       </w:pPr>
       <w:r>
         <w:t>Recorded user response to an estimated duration.</w:t>
@@ -18110,14 +17847,19 @@
     <w:p>
       <w:pPr>
         <w:pStyle w:val="Heading3"/>
+        <w:keepNext/>
       </w:pPr>
       <w:r>
+        <w:rPr>
+          <w:color w:val="000000"/>
+        </w:rPr>
         <w:t>8 3 14 task duration baselines</w:t>
       </w:r>
     </w:p>
     <w:p>
       <w:pPr>
         <w:keepNext/>
+        <w:jc w:val="left"/>
       </w:pPr>
       <w:r>
         <w:t>Reference estimate used for duration evaluation.</w:t>
@@ -18956,14 +18698,19 @@
     <w:p>
       <w:pPr>
         <w:pStyle w:val="Heading3"/>
+        <w:keepNext/>
       </w:pPr>
       <w:r>
+        <w:rPr>
+          <w:color w:val="000000"/>
+        </w:rPr>
         <w:t>8 3 15 weekly ai insights</w:t>
       </w:r>
     </w:p>
     <w:p>
       <w:pPr>
         <w:keepNext/>
+        <w:jc w:val="left"/>
       </w:pPr>
       <w:r>
         <w:t>Cached weekly metrics and generated narrative.</w:t>
@@ -20068,14 +19815,19 @@
     <w:p>
       <w:pPr>
         <w:pStyle w:val="Heading3"/>
+        <w:keepNext/>
       </w:pPr>
       <w:r>
+        <w:rPr>
+          <w:color w:val="000000"/>
+        </w:rPr>
         <w:t>8 3 16 ai generation events</w:t>
       </w:r>
     </w:p>
     <w:p>
       <w:pPr>
         <w:keepNext/>
+        <w:jc w:val="left"/>
       </w:pPr>
       <w:r>
         <w:t>Provider generation metrics without prompt text.</w:t>
@@ -21313,14 +21065,19 @@
     <w:p>
       <w:pPr>
         <w:pStyle w:val="Heading3"/>
+        <w:keepNext/>
       </w:pPr>
       <w:r>
+        <w:rPr>
+          <w:color w:val="000000"/>
+        </w:rPr>
         <w:t>8 3 17 user gamification profiles</w:t>
       </w:r>
     </w:p>
     <w:p>
       <w:pPr>
         <w:keepNext/>
+        <w:jc w:val="left"/>
       </w:pPr>
       <w:r>
         <w:t>Per-user growth point and activity totals.</w:t>
@@ -22292,14 +22049,19 @@
     <w:p>
       <w:pPr>
         <w:pStyle w:val="Heading3"/>
+        <w:keepNext/>
       </w:pPr>
       <w:r>
+        <w:rPr>
+          <w:color w:val="000000"/>
+        </w:rPr>
         <w:t>8 3 18 plant species</w:t>
       </w:r>
     </w:p>
     <w:p>
       <w:pPr>
         <w:keepNext/>
+        <w:jc w:val="left"/>
       </w:pPr>
       <w:r>
         <w:t>Shared catalogue of available plant types.</w:t>
@@ -23271,14 +23033,19 @@
     <w:p>
       <w:pPr>
         <w:pStyle w:val="Heading3"/>
+        <w:keepNext/>
       </w:pPr>
       <w:r>
+        <w:rPr>
+          <w:color w:val="000000"/>
+        </w:rPr>
         <w:t>8 3 19 user plants</w:t>
       </w:r>
     </w:p>
     <w:p>
       <w:pPr>
         <w:keepNext/>
+        <w:jc w:val="left"/>
       </w:pPr>
       <w:r>
         <w:t>Plant progress and forest placement for a user.</w:t>
@@ -24782,14 +24549,19 @@
     <w:p>
       <w:pPr>
         <w:pStyle w:val="Heading3"/>
+        <w:keepNext/>
       </w:pPr>
       <w:r>
+        <w:rPr>
+          <w:color w:val="000000"/>
+        </w:rPr>
         <w:t>8 3 20 achievements</w:t>
       </w:r>
     </w:p>
     <w:p>
       <w:pPr>
         <w:keepNext/>
+        <w:jc w:val="left"/>
       </w:pPr>
       <w:r>
         <w:t>Shared achievement catalogue.</w:t>
@@ -25761,14 +25533,19 @@
     <w:p>
       <w:pPr>
         <w:pStyle w:val="Heading3"/>
+        <w:keepNext/>
       </w:pPr>
       <w:r>
+        <w:rPr>
+          <w:color w:val="000000"/>
+        </w:rPr>
         <w:t>8 3 21 user achievements</w:t>
       </w:r>
     </w:p>
     <w:p>
       <w:pPr>
         <w:keepNext/>
+        <w:jc w:val="left"/>
       </w:pPr>
       <w:r>
         <w:t>Unlock and claim state for an account.</w:t>
@@ -26474,14 +26251,19 @@
     <w:p>
       <w:pPr>
         <w:pStyle w:val="Heading3"/>
+        <w:keepNext/>
       </w:pPr>
       <w:r>
+        <w:rPr>
+          <w:color w:val="000000"/>
+        </w:rPr>
         <w:t>8 3 22 reward events</w:t>
       </w:r>
     </w:p>
     <w:p>
       <w:pPr>
         <w:keepNext/>
+        <w:jc w:val="left"/>
       </w:pPr>
       <w:r>
         <w:t>Deduplicated reward award records.</w:t>
@@ -27320,98 +27102,153 @@
     <w:p>
       <w:pPr>
         <w:pStyle w:val="Heading2"/>
+        <w:keepNext/>
       </w:pPr>
       <w:r>
+        <w:rPr>
+          <w:color w:val="000000"/>
+        </w:rPr>
         <w:t>8 4 Data lifecycle and reporting semantics</w:t>
       </w:r>
     </w:p>
     <w:p>
+      <w:pPr>
+        <w:jc w:val="left"/>
+      </w:pPr>
       <w:r>
-        <w:t>Task creation assigns the authenticated owner, validates the project reference and stores the supplied task fields. Updates preserve the record identity. Moving a task into done sets completed_at to the current UTC time; reopening it clears completed_at. A done task with a missing completion timestamp is repaired on update. Analytics use completion timestamps rather than treating every edit as a new completion. [R6]</w:t>
+        <w:t>Tasks retain the same identity as their details change. Completing a task records completed_at, while reopening it clears that value. Analytics use the completion time to distinguish completed work from later edits. This supports progress reporting without treating every update as another completion. [R5]</w:t>
       </w:r>
     </w:p>
     <w:p>
+      <w:pPr>
+        <w:jc w:val="left"/>
+      </w:pPr>
       <w:r>
-        <w:t>Overdue is computed when an unfinished task has a non-null deadline earlier than the current UTC time. It is not a fourth database status. A completed task therefore does not remain overdue merely because its deadline is in the past. A task without a deadline is also not overdue. Deleting a project clears its tasks' project references and exposes those tasks in Inbox; it must not remove the tasks themselves.</w:t>
+        <w:t>Overdue describes an unfinished task whose deadline has passed. It is calculated from the task’s status and deadline rather than stored as a fourth workflow status. Completed tasks and tasks without a deadline are not overdue. Removing a project clears its task associations and leaves those tasks in Inbox.</w:t>
       </w:r>
     </w:p>
     <w:p>
+      <w:pPr>
+        <w:jc w:val="left"/>
+      </w:pPr>
       <w:r>
-        <w:t>Timestamp columns use timezone-aware database types. The API normalises deadline instants to UTC, while user_settings.timezone supplies the IANA timezone for local dates and reporting boundaries. The timezone helpers derive adjacent local midnights and convert them to UTC, allowing daylight saving days to differ from 24 hours. Work_start and work_end are local times of day, not absolute timestamp values. [R5, R6]</w:t>
+        <w:t>Timestamp fields store absolute instants with timezone support. The API normalises deadlines to UTC, while the account timezone determines local dates and reporting periods. Reporting boundaries account for daylight saving changes rather than assuming every local day lasts 24 hours. Work start and end preferences represent local times of day. [R4, R5]</w:t>
       </w:r>
     </w:p>
     <w:p>
+      <w:pPr>
+        <w:jc w:val="left"/>
+      </w:pPr>
       <w:r>
-        <w:t>Focus sessions distinguish planned minutes from actual recorded seconds and from lifecycle status. Dashboard and analytics calculations must use the relevant completed activity rather than assuming the legacy completed flag alone describes every timer state. Scheduling proposals preserve input and before or after snapshots to support state validation and undo behaviour. Reward uniqueness keys protect against awarding the same source event twice; they do not replace ownership checks. [R7, R8]</w:t>
+        <w:t>Focus records distinguish planned duration, actual recorded effort, and session status. Scheduling proposals preserve the relevant input and before-and-after state so a proposed change can be checked and, where supported, undone. Reward records use a unique source reference to prevent the same qualifying event from being awarded twice. [R6, R7]</w:t>
       </w:r>
     </w:p>
     <w:p>
       <w:pPr>
         <w:pStyle w:val="Heading2"/>
+        <w:keepNext/>
       </w:pPr>
       <w:r>
+        <w:rPr>
+          <w:color w:val="000000"/>
+        </w:rPr>
         <w:t>8 5 Integrity rules and indexes</w:t>
       </w:r>
     </w:p>
     <w:p>
+      <w:pPr>
+        <w:jc w:val="left"/>
+      </w:pPr>
       <w:r>
-        <w:t>Foreign keys prevent orphan relational references, while unique constraints protect one settings record per account, one achievement unlock per user and achievement, duplicate reward source events, and duplicate weekly insight cache identities. Task status and priority use PostgreSQL enum types. Additional CHECK constraints restrict user roles, settings ranges, proposal states, nonnegative AI telemetry and valid duration decisions.</w:t>
+        <w:t>Foreign keys maintain the relationships between records. Unique constraints protect one settings record per account, one achievement unlock per user and achievement, and one reward for each source event. Additional constraints restrict status values, preference ranges, proposal states, and nonnegative activity measurements. These rules support consistent records across the app’s features.</w:t>
       </w:r>
     </w:p>
     <w:p>
+      <w:pPr>
+        <w:jc w:val="left"/>
+      </w:pPr>
       <w:r>
-        <w:t>The locked-task constraint requires both scheduled endpoints and a positive interval when schedule_locked is true. Focus lifecycle migrations also add positive planned duration and nonnegative actual duration checks. Those focus constraints are present in migrations but are not restated in the current ORM table arguments; schema maintenance must compare both sources rather than assuming the model file is the complete deployed schema. [R9]</w:t>
+        <w:t>A locked schedule requires a start time, an end time, and a positive interval. Focus sessions require a positive planned duration and nonnegative recorded effort. The installed schema includes constraints introduced through migrations as well as those declared in the application models. [R8]</w:t>
       </w:r>
     </w:p>
     <w:p>
+      <w:pPr>
+        <w:jc w:val="left"/>
+      </w:pPr>
       <w:r>
-        <w:t>Indexes commonly support user-scoped lookups and task or project references. Composite indexes support AI generation history by user or feature and time, proposals by user and status and creation time, duration decisions by user and task and resolution time, and weekly insight history by user and time. These choices match the application's access patterns, but do not establish measured performance at production scale. Query plans and timings should be collected before adding speculative indexes.</w:t>
+        <w:t>Indexes support common lookups by account, task, project, and reporting period. Composite indexes support histories such as AI generation activity, schedule proposals, and duration decisions. The task status-count operation aggregates existing records for the current account; it adds no table or database field. These design choices reduce unnecessary retrieval, but no production-scale timing result is claimed.</w:t>
       </w:r>
     </w:p>
     <w:p>
       <w:pPr>
         <w:pStyle w:val="Heading2"/>
+        <w:keepNext/>
       </w:pPr>
       <w:r>
+        <w:rPr>
+          <w:color w:val="000000"/>
+        </w:rPr>
         <w:t>8 6 Migration management</w:t>
       </w:r>
     </w:p>
     <w:p>
+      <w:pPr>
+        <w:jc w:val="left"/>
+      </w:pPr>
       <w:r>
-        <w:t>Alembic imports the application models into shared metadata and enables type comparison. The source history currently contains 32 revisions, with one root a374ab74f829, one head d7b2a6e14f09 and no missing parent references in a static graph check. Merge revisions preserve earlier parallel feature histories. The number of migration files reflects schema evolution, not 32 databases or duplicate active schemas. [R9]</w:t>
+        <w:t>Alembic manages the evolution of the PostgreSQL schema through versioned migrations. The current source contains 32 revisions leading to one head, d7b2a6e14f09. The history includes earlier parallel feature work that was merged into a single upgrade path. A schema revision identifies the database structure expected by a corresponding application release. [R8]</w:t>
       </w:r>
     </w:p>
     <w:p>
+      <w:pPr>
+        <w:jc w:val="left"/>
+      </w:pPr>
       <w:r>
-        <w:t>Existing revision files must remain available for installation and upgrade. Deleting old files to reduce clutter can break a database that records an earlier revision. A new schema change should add a reviewed migration with a clear upgrade path, data backfill where necessary, and a documented rollback consequence. A downgrade is not a substitute for a backup.</w:t>
+        <w:t>Migrations retain the steps needed to install a new database or update an existing one. Some changes also transform existing records. For example, weekly insight migration keeps the newest entry for an account and week before adding uniqueness, and focus migrations populate duration and status fields from earlier records.</w:t>
       </w:r>
     </w:p>
     <w:p>
+      <w:pPr>
+        <w:jc w:val="left"/>
+      </w:pPr>
       <w:r>
-        <w:t>The latest weekly insight migration derives a local week key, retains the newest cache entry for each user and week, removes older duplicates, and adds uniqueness. Because deleted duplicate rows cannot be reconstructed by simply reversing the schema change, take a backup before upgrading existing data. Focus lifecycle migrations similarly backfill new duration and status fields from legacy records. These examples require data verification as well as structural verification.</w:t>
+        <w:t>A backup is needed before applying changes that remove or transform existing data. Reversing a schema change does not recreate deleted records. Installation and upgrade verification therefore covers both the final structure and representative stored values.</w:t>
       </w:r>
     </w:p>
     <w:p>
+      <w:pPr>
+        <w:jc w:val="left"/>
+      </w:pPr>
       <w:r>
-        <w:t>A migration graph check does not prove a fresh database can upgrade successfully. The release procedure must test both a clean database and a copy of any supported earlier database. Record the starting revision, target revision, row counts for important entities and representative task, focus and cache values. Chapter 11 provides the commands and acceptance checks.</w:t>
+        <w:t>A complete upgrade check uses a clean database and a separate copy of a supported earlier database. Task ownership, completion times, focus activity, and reporting records provide useful checks that existing behaviour and data have been preserved.</w:t>
       </w:r>
     </w:p>
     <w:p>
       <w:pPr>
         <w:pStyle w:val="Heading2"/>
+        <w:keepNext/>
       </w:pPr>
       <w:r>
-        <w:t>8 7 Demonstration data</w:t>
+        <w:rPr>
+          <w:color w:val="000000"/>
+        </w:rPr>
+        <w:t>8 7 Demonstration records</w:t>
       </w:r>
     </w:p>
     <w:p>
+      <w:pPr>
+        <w:jc w:val="left"/>
+      </w:pPr>
       <w:r>
-        <w:t>The seed script creates or reuses a synthetic demo account and six projects named University, Internship, Personal, Research, Health and Creative. It supplies tasks with different priorities, statuses, relative deadlines, durations and subtasks, including unassigned tasks. Dates are generated relative to the execution date, so the resulting overdue and upcoming examples remain useful for a demonstration. [R11]</w:t>
+        <w:t>The demonstration dataset uses a synthetic account and six projects: University, Internship, Personal, Research, Health, and Creative. Tasks cover different priorities, statuses, durations, deadlines, and subtasks, including tasks in Inbox. Relative dates provide examples of overdue and upcoming work. [R10]</w:t>
       </w:r>
     </w:p>
     <w:p>
+      <w:pPr>
+        <w:jc w:val="left"/>
+      </w:pPr>
       <w:r>
-        <w:t>Run the script only in an isolated demonstration database. A rerun updates matching projects and tasks, moves relative dates, resets task fields and rebuilds subtasks. It is therefore not a read-only fixture loader. If the demo email already exists, the script reuses that user without resetting its password. The script alone does not provide every focus, AI and forest scenario; those should be prepared through the supported application flows. A separate new account should be retained for empty-state checks.</w:t>
+        <w:t>The dataset is intended for an isolated demonstration environment. Recreating it updates matching tasks and projects, resets selected fields, and rebuilds subtasks. Focus, AI, and forest scenarios can be prepared through the app, while a separate new account shows the empty experience.</w:t>
       </w:r>
     </w:p>
     <w:p>
@@ -27422,57 +27259,88 @@
     <w:p>
       <w:pPr>
         <w:pStyle w:val="Heading1"/>
+        <w:keepNext/>
       </w:pPr>
       <w:r>
+        <w:rPr>
+          <w:color w:val="000000"/>
+        </w:rPr>
         <w:t>9 Security and Data Handling</w:t>
       </w:r>
     </w:p>
     <w:p>
       <w:pPr>
         <w:pStyle w:val="Heading2"/>
+        <w:keepNext/>
       </w:pPr>
       <w:r>
+        <w:rPr>
+          <w:color w:val="000000"/>
+        </w:rPr>
         <w:t>9 1 Authentication and storage of credentials</w:t>
       </w:r>
     </w:p>
     <w:p>
+      <w:pPr>
+        <w:jc w:val="left"/>
+      </w:pPr>
       <w:r>
-        <w:t>Passwords are hashed through pwdlib's recommended password hasher using the installed Argon2 support. The database stores password_hash rather than plaintext passwords, and public user schemas omit the hash. Registration validates email, password length, allowed public roles and timezone input. Duplicate normalised email addresses are rejected. [R5]</w:t>
+        <w:t>Account passwords are stored as hashes using Argon2 support through the configured password library. Public profile responses exclude those hashes. Registration validates email, password length, account role, and timezone, and rejects duplicate normalised email addresses. [R4]</w:t>
       </w:r>
     </w:p>
     <w:p>
+      <w:pPr>
+        <w:jc w:val="left"/>
+      </w:pPr>
       <w:r>
-        <w:t>After a successful login, the API issues a signed JWT containing the user identifier, issue time and expiry. The configured default is HS256 with a 30 minute lifetime. Authentication verifies the configured algorithm, decodes the user UUID and checks that the account exists and is active. Invalid or expired credentials lead to an authentication error. An administrative role helper supplies a further 403 response where restricted access is required.</w:t>
+        <w:t>After sign-in, the API issues a signed access token that identifies the user and has an expiry. The default token lifetime is 30 minutes. For protected requests, the API verifies the token and checks that the account exists and is active. Expired or invalid credentials are rejected.</w:t>
       </w:r>
     </w:p>
     <w:p>
+      <w:pPr>
+        <w:jc w:val="left"/>
+      </w:pPr>
       <w:r>
-        <w:t>The browser stores the access token locally and clears local session state on logout or credential recovery. This storage is accessible to JavaScript, so preventing script injection remains important. Local logout is not server-side revocation of an already issued token. The implementation should not be described as providing refresh tokens, a revocation blacklist or centrally invalidated sessions. [R2, R5]</w:t>
+        <w:t>The browser keeps the access token locally to support the session. Logging out clears that browser’s stored session information, but does not revoke a token already issued by the API. The current design does not provide refresh tokens or central session revocation. Because browser scripts can access local storage, protection against script injection remains an important deployment concern. [R1, R4]</w:t>
       </w:r>
     </w:p>
     <w:p>
       <w:pPr>
         <w:pStyle w:val="Heading2"/>
+        <w:keepNext/>
       </w:pPr>
       <w:r>
+        <w:rPr>
+          <w:color w:val="000000"/>
+        </w:rPr>
         <w:t>9 2 Ownership and authorisation</w:t>
       </w:r>
     </w:p>
     <w:p>
+      <w:pPr>
+        <w:jc w:val="left"/>
+      </w:pPr>
       <w:r>
-        <w:t>Routes and services derive ownership from the authenticated user rather than trusting a caller-supplied user identifier. Project and task lookups filter by user_id; cross-account resources are normally treated as unavailable. Task creation and update must also validate that any project belongs to the same user. A valid project foreign key alone cannot guarantee that task and project owners match, because that rule is enforced at the service layer. [R6]</w:t>
+        <w:t>Access checks use the authenticated account rather than a user identifier supplied in the request. Task and project lookups are limited to that account, and a selected project must belong to the same owner as the task. This service-level check complements the database relationship: a valid project identifier alone is not sufficient to grant access. [R5]</w:t>
       </w:r>
     </w:p>
     <w:p>
+      <w:pPr>
+        <w:jc w:val="left"/>
+      </w:pPr>
       <w:r>
-        <w:t>Database cascades control dependent records when their parents are deleted. They do not grant permission to delete the parent. Negative tests should attempt to read, modify and delete another account's task, project, notification and focus records and confirm that no data is returned or changed. These checks belong in the shared security evidence with Duy and in Phat's testing results.</w:t>
+        <w:t>Database deletion rules preserve relationships after an authorised operation; they do not grant permission to perform it. Account separation therefore depends on access checks before records are read, modified, or deleted. Cross-account isolation is an essential property to verify for tasks, projects, notifications, and focus records.</w:t>
       </w:r>
     </w:p>
     <w:p>
       <w:pPr>
         <w:pStyle w:val="Heading2"/>
+        <w:keepNext/>
       </w:pPr>
       <w:r>
+        <w:rPr>
+          <w:color w:val="000000"/>
+        </w:rPr>
         <w:t>9 3 Data classification and external processing</w:t>
       </w:r>
     </w:p>
@@ -27580,18 +27448,13 @@
             </w:tcMar>
           </w:tcPr>
           <w:p>
-            <w:pPr>
-              <w:keepNext/>
-              <w:spacing w:after="20" w:before="20" w:line="245" w:lineRule="auto"/>
-              <w:jc w:val="center"/>
-            </w:pPr>
             <w:r>
               <w:rPr>
                 <w:b/>
                 <w:color w:val="FFFFFF"/>
                 <w:sz w:val="19"/>
               </w:rPr>
-              <w:t>Handling requirement</w:t>
+              <w:t>Handling boundary</w:t>
             </w:r>
           </w:p>
         </w:tc>
@@ -27685,17 +27548,11 @@
             </w:tcMar>
           </w:tcPr>
           <w:p>
-            <w:pPr>
-              <w:keepNext/>
-              <w:spacing w:after="20" w:before="20" w:line="245" w:lineRule="auto"/>
-            </w:pPr>
-            <w:r>
-              <w:rPr>
-                <w:b w:val="0"/>
-                <w:color w:val="000000"/>
+            <w:r>
+              <w:rPr>
                 <w:sz w:val="19"/>
               </w:rPr>
-              <w:t>Never place secrets in browser bundles, report examples, logs or version control. Use fresh values for each environment.</w:t>
+              <w:t>Secrets remain server-side and need protected storage in each environment.</w:t>
             </w:r>
           </w:p>
         </w:tc>
@@ -27787,16 +27644,11 @@
             </w:tcMar>
           </w:tcPr>
           <w:p>
-            <w:pPr>
-              <w:spacing w:after="20" w:before="20" w:line="245" w:lineRule="auto"/>
-            </w:pPr>
-            <w:r>
-              <w:rPr>
-                <w:b w:val="0"/>
-                <w:color w:val="000000"/>
+            <w:r>
+              <w:rPr>
                 <w:sz w:val="19"/>
               </w:rPr>
-              <w:t>Limit access by owner and restrict database and backup access.</w:t>
+              <w:t>Access is limited by account ownership; database and backup access also require restriction.</w:t>
             </w:r>
           </w:p>
         </w:tc>
@@ -27888,16 +27740,11 @@
             </w:tcMar>
           </w:tcPr>
           <w:p>
-            <w:pPr>
-              <w:spacing w:after="20" w:before="20" w:line="245" w:lineRule="auto"/>
-            </w:pPr>
-            <w:r>
-              <w:rPr>
-                <w:b w:val="0"/>
-                <w:color w:val="000000"/>
+            <w:r>
+              <w:rPr>
                 <w:sz w:val="19"/>
               </w:rPr>
-              <w:t>Treat images and filenames as personal data. Protect backups and apply a defined cleanup policy.</w:t>
+              <w:t>Images use separate storage and require media backup and a retention policy.</w:t>
             </w:r>
           </w:p>
         </w:tc>
@@ -27989,16 +27836,11 @@
             </w:tcMar>
           </w:tcPr>
           <w:p>
-            <w:pPr>
-              <w:spacing w:after="20" w:before="20" w:line="245" w:lineRule="auto"/>
-            </w:pPr>
-            <w:r>
-              <w:rPr>
-                <w:b w:val="0"/>
-                <w:color w:val="000000"/>
+            <w:r>
+              <w:rPr>
                 <w:sz w:val="19"/>
               </w:rPr>
-              <w:t>Explain third-party processing and send only required context. User preferences and global configuration control AI availability.</w:t>
+              <w:t>Selected context can be processed by Gemini when the feature is enabled; credentials stay in the API.</w:t>
             </w:r>
           </w:p>
         </w:tc>
@@ -28090,16 +27932,11 @@
             </w:tcMar>
           </w:tcPr>
           <w:p>
-            <w:pPr>
-              <w:spacing w:after="20" w:before="20" w:line="245" w:lineRule="auto"/>
-            </w:pPr>
-            <w:r>
-              <w:rPr>
-                <w:b w:val="0"/>
-                <w:color w:val="000000"/>
+            <w:r>
+              <w:rPr>
                 <w:sz w:val="19"/>
               </w:rPr>
-              <w:t>Telemetry does not store raw prompts, but other application tables do store user content and generated text.</w:t>
+              <w:t>Generation telemetry excludes raw prompts; other app tables can contain user content and generated text.</w:t>
             </w:r>
           </w:p>
         </w:tc>
@@ -28113,42 +27950,65 @@
     <w:p>
       <w:pPr>
         <w:pStyle w:val="Heading2"/>
+        <w:keepNext/>
       </w:pPr>
       <w:r>
+        <w:rPr>
+          <w:color w:val="000000"/>
+        </w:rPr>
         <w:t>9 4 Avatar validation and retention</w:t>
       </w:r>
     </w:p>
     <w:p>
+      <w:pPr>
+        <w:jc w:val="left"/>
+      </w:pPr>
       <w:r>
-        <w:t>Avatar upload handling restricts supported formats to JPEG, PNG and WebP, checks extension, declared MIME type and file signatures, and enforces a default maximum of 2 MiB. Generated UUID filenames reduce reliance on user-supplied names. These checks reduce upload risk but are not evidence of antivirus scanning or image re-encoding. [R5]</w:t>
+        <w:t>Profile-image uploads support JPEG, PNG, and WebP, with a default size limit of 2 MiB. Upload checks compare the extension, declared content type, and file signature. The service generates filenames rather than relying on the original upload name. These controls validate supported uploads; antivirus scanning and image re-encoding are not part of the current implementation. [R4]</w:t>
       </w:r>
     </w:p>
     <w:p>
+      <w:pPr>
+        <w:jc w:val="left"/>
+      </w:pPr>
       <w:r>
-        <w:t>The API serves media through a static /media mount, which does not perform per-file ownership authentication. Anyone who knows a valid media URL may request the file. An avatar-removal operation clears the stored path, but does not unlink the old file, and replacements can leave old files behind. A retention and orphan-file cleanup procedure is therefore a maintenance requirement, not an implemented deletion guarantee.</w:t>
+        <w:t>Profile images are served through media URLs without per-file authentication. Anyone who knows a valid URL can request the image. Removing or replacing an avatar clears or changes its stored reference, but can leave the earlier file in storage. Media access and removal therefore require a defined retention policy and file-cleanup process.</w:t>
       </w:r>
     </w:p>
     <w:p>
       <w:pPr>
         <w:pStyle w:val="Heading2"/>
+        <w:keepNext/>
       </w:pPr>
       <w:r>
-        <w:t>9 5 Configuration boundaries and remaining controls</w:t>
+        <w:rPr>
+          <w:color w:val="000000"/>
+        </w:rPr>
+        <w:t>9 5 Deployment security boundaries</w:t>
       </w:r>
     </w:p>
     <w:p>
+      <w:pPr>
+        <w:jc w:val="left"/>
+      </w:pPr>
       <w:r>
-        <w:t>Environment files are excluded from normal source tracking, with example files retained for setup. Before handover, example secrets should be replaced with clear placeholders and fresh secrets generated for the receiving environment. Keep the JWT signing value consistent between API startup settings and Compose overrides. Provider keys remain in the API environment. Never include real environment files or personal database dumps in the submission.</w:t>
+        <w:t>Database credentials, token-signing secrets, and AI provider keys belong in the server environment. Browser configuration contains the public API address rather than those secrets. Environment templates support installation, while each deployed environment needs its own protected secret values.</w:t>
       </w:r>
     </w:p>
     <w:p>
+      <w:pPr>
+        <w:jc w:val="left"/>
+      </w:pPr>
       <w:r>
-        <w:t>The present CORS configuration is designed for local browser origins and local ports. It is not a production origin policy. The AI request limiter is process-local and therefore cannot be treated as a distributed account-wide limit across multiple API workers. No equivalent login rate limiting should be claimed without an implementation and verification record. [R3, R8]</w:t>
+        <w:t>The supplied origin policy supports local demonstrations. Its AI request limit is held in one API process, so it does not represent a shared limit across several workers. The local configuration does not establish a complete set of public authentication-abuse controls. [R2, R7]</w:t>
       </w:r>
     </w:p>
     <w:p>
+      <w:pPr>
+        <w:jc w:val="left"/>
+      </w:pPr>
       <w:r>
-        <w:t>A public deployment should add TLS termination, an explicit origin allowlist, private database networking, managed secrets, restricted upload access if private avatars are required, authentication abuse controls and scheduled backup and retention jobs. These are deployment hardening actions, not controls already supplied by the demonstration Compose file. Encryption at rest, a completed restore drill and a formal retention schedule must be evidenced separately.</w:t>
+        <w:t>Public hosting requires HTTPS, a restricted browser-origin policy, private database access, protected secrets, and durable storage for profile images. Backup, retention, and recovery procedures also need to be defined and verified for that environment. These are deployment requirements rather than completed production-security results.</w:t>
       </w:r>
     </w:p>
     <w:p>
@@ -28159,22 +28019,33 @@
     <w:p>
       <w:pPr>
         <w:pStyle w:val="Heading1"/>
+        <w:keepNext/>
       </w:pPr>
       <w:r>
-        <w:t>11 Installation Deployment and Maintenance</w:t>
+        <w:rPr>
+          <w:color w:val="000000"/>
+        </w:rPr>
+        <w:t>11 Deployment and Operation</w:t>
       </w:r>
     </w:p>
     <w:p>
       <w:pPr>
         <w:pStyle w:val="Heading2"/>
+        <w:keepNext/>
       </w:pPr>
       <w:r>
-        <w:t>11 1 Environment and prerequisites</w:t>
+        <w:rPr>
+          <w:color w:val="000000"/>
+        </w:rPr>
+        <w:t>11 1 Runtime environment</w:t>
       </w:r>
     </w:p>
     <w:p>
+      <w:pPr>
+        <w:jc w:val="left"/>
+      </w:pPr>
       <w:r>
-        <w:t>Two installation paths are supported by the repository structure: run the database in Docker while running the API and frontend on the host for development, or build all three services with Docker Compose. The host development path below uses frontend port 3001 to match the demonstration workflow. The Compose web service uses port 3000. [R10, R12]</w:t>
+        <w:t>Chrono can run with PostgreSQL in Docker and the web interface and API on the host, or with all three services in Docker Compose. The web interface, application API, and database have separate runtime responsibilities. The table below describes the repository’s declared runtime baseline. [R9, R11]</w:t>
       </w:r>
     </w:p>
     <w:tbl>
@@ -28247,18 +28118,13 @@
             </w:tcMar>
           </w:tcPr>
           <w:p>
-            <w:pPr>
-              <w:keepNext/>
-              <w:spacing w:after="20" w:before="20" w:line="245" w:lineRule="auto"/>
-              <w:jc w:val="center"/>
-            </w:pPr>
             <w:r>
               <w:rPr>
                 <w:b/>
                 <w:color w:val="FFFFFF"/>
                 <w:sz w:val="19"/>
               </w:rPr>
-              <w:t>Repository baseline</w:t>
+              <w:t>Declared baseline</w:t>
             </w:r>
           </w:p>
         </w:tc>
@@ -28801,107 +28667,6 @@
                 <w:sz w:val="19"/>
               </w:rPr>
               <w:t>Start PostgreSQL or the complete application stack.</w:t>
-            </w:r>
-          </w:p>
-        </w:tc>
-      </w:tr>
-      <w:tr>
-        <w:trPr>
-          <w:cantSplit/>
-        </w:trPr>
-        <w:tc>
-          <w:tcPr>
-            <w:tcW w:type="dxa" w:w="1584"/>
-            <w:vAlign w:val="center"/>
-            <w:shd w:fill="F1F5F8"/>
-            <w:tcBorders>
-              <w:top w:val="single" w:sz="4" w:color="D9D9D9"/>
-              <w:left w:val="single" w:sz="4" w:color="D9D9D9"/>
-              <w:bottom w:val="single" w:sz="4" w:color="D9D9D9"/>
-              <w:right w:val="single" w:sz="4" w:color="D9D9D9"/>
-            </w:tcBorders>
-            <w:tcMar>
-              <w:top w:w="80" w:type="dxa"/>
-              <w:left w:w="80" w:type="dxa"/>
-              <w:bottom w:w="80" w:type="dxa"/>
-              <w:right w:w="80" w:type="dxa"/>
-            </w:tcMar>
-          </w:tcPr>
-          <w:p>
-            <w:pPr>
-              <w:spacing w:after="20" w:before="20" w:line="245" w:lineRule="auto"/>
-            </w:pPr>
-            <w:r>
-              <w:rPr>
-                <w:b w:val="0"/>
-                <w:color w:val="000000"/>
-                <w:sz w:val="19"/>
-              </w:rPr>
-              <w:t>Git</w:t>
-            </w:r>
-          </w:p>
-        </w:tc>
-        <w:tc>
-          <w:tcPr>
-            <w:tcW w:type="dxa" w:w="4536"/>
-            <w:vAlign w:val="center"/>
-            <w:shd w:fill="F1F5F8"/>
-            <w:tcBorders>
-              <w:top w:val="single" w:sz="4" w:color="D9D9D9"/>
-              <w:left w:val="single" w:sz="4" w:color="D9D9D9"/>
-              <w:bottom w:val="single" w:sz="4" w:color="D9D9D9"/>
-              <w:right w:val="single" w:sz="4" w:color="D9D9D9"/>
-            </w:tcBorders>
-            <w:tcMar>
-              <w:top w:w="80" w:type="dxa"/>
-              <w:left w:w="80" w:type="dxa"/>
-              <w:bottom w:w="80" w:type="dxa"/>
-              <w:right w:w="80" w:type="dxa"/>
-            </w:tcMar>
-          </w:tcPr>
-          <w:p>
-            <w:pPr>
-              <w:spacing w:after="20" w:before="20" w:line="245" w:lineRule="auto"/>
-            </w:pPr>
-            <w:r>
-              <w:rPr>
-                <w:b w:val="0"/>
-                <w:color w:val="000000"/>
-                <w:sz w:val="19"/>
-              </w:rPr>
-              <w:t>Repository access and chosen release revision</w:t>
-            </w:r>
-          </w:p>
-        </w:tc>
-        <w:tc>
-          <w:tcPr>
-            <w:tcW w:type="dxa" w:w="4104"/>
-            <w:vAlign w:val="center"/>
-            <w:shd w:fill="F1F5F8"/>
-            <w:tcBorders>
-              <w:top w:val="single" w:sz="4" w:color="D9D9D9"/>
-              <w:left w:val="single" w:sz="4" w:color="D9D9D9"/>
-              <w:bottom w:val="single" w:sz="4" w:color="D9D9D9"/>
-              <w:right w:val="single" w:sz="4" w:color="D9D9D9"/>
-            </w:tcBorders>
-            <w:tcMar>
-              <w:top w:w="80" w:type="dxa"/>
-              <w:left w:w="80" w:type="dxa"/>
-              <w:bottom w:w="80" w:type="dxa"/>
-              <w:right w:w="80" w:type="dxa"/>
-            </w:tcMar>
-          </w:tcPr>
-          <w:p>
-            <w:pPr>
-              <w:spacing w:after="20" w:before="20" w:line="245" w:lineRule="auto"/>
-            </w:pPr>
-            <w:r>
-              <w:rPr>
-                <w:b w:val="0"/>
-                <w:color w:val="000000"/>
-                <w:sz w:val="19"/>
-              </w:rPr>
-              <w:t>Obtain and identify the submission source.</w:t>
             </w:r>
           </w:p>
         </w:tc>
@@ -28913,122 +28678,39 @@
       </w:pPr>
     </w:p>
     <w:p>
+      <w:pPr>
+        <w:jc w:val="left"/>
+      </w:pPr>
       <w:r>
-        <w:t>The frontend manifest specifies Next.js ^16.0.8 and React ^19.2.3; the lockfile determines the resolved package versions. Backend dependencies have version ranges and uv lockfiles are present, but the current Docker build installs through pip without enforcing those locks. Record the actual resolved Python environment during handover instead of presenting a dependency range as an exact reproduced build.</w:t>
+        <w:t>The frontend uses Next.js and React, with package versions resolved through the pnpm lockfile. The API uses Python, FastAPI, SQLAlchemy, and Alembic. PostgreSQL 16 is the database image used in Compose. The backend container currently installs declared Python dependency ranges; a reproducible release also needs the resolved backend environment to be recorded.</w:t>
       </w:r>
     </w:p>
     <w:p>
       <w:pPr>
         <w:pStyle w:val="Heading2"/>
+        <w:keepNext/>
       </w:pPr>
       <w:r>
-        <w:t>11 2 Source and environment setup</w:t>
-      </w:r>
-    </w:p>
-    <w:p>
-      <w:r>
-        <w:t>Start from a clean checkout of the agreed submission revision. Use develop during continuing development, then record a final commit or tag once the team freezes the release. The current working tree contains local changes, so its base commit alone is not the final release identifier. The commands below are a runbook and should be executed by the installer in that clean checkout.</w:t>
+        <w:rPr>
+          <w:color w:val="000000"/>
+        </w:rPr>
+        <w:t>11 2 Application configuration</w:t>
       </w:r>
     </w:p>
     <w:p>
       <w:pPr>
-        <w:spacing w:after="40" w:before="0"/>
+        <w:jc w:val="left"/>
       </w:pPr>
       <w:r>
-        <w:rPr>
-          <w:rFonts w:ascii="Consolas" w:hAnsi="Consolas"/>
-          <w:sz w:val="18"/>
-        </w:rPr>
-        <w:t>git clone &lt;repository-url&gt; CHRONO</w:t>
+        <w:t>Configuration connects the browser, API, and database in the selected environment. The browser needs an API address it can reach, while the API needs a database connection and token-signing secret. Optional AI features also require server-side provider configuration.</w:t>
       </w:r>
     </w:p>
     <w:p>
       <w:pPr>
-        <w:spacing w:after="40" w:before="0"/>
+        <w:jc w:val="left"/>
       </w:pPr>
       <w:r>
-        <w:rPr>
-          <w:rFonts w:ascii="Consolas" w:hAnsi="Consolas"/>
-          <w:sz w:val="18"/>
-        </w:rPr>
-        <w:t>Set-Location CHRONO</w:t>
-      </w:r>
-    </w:p>
-    <w:p>
-      <w:pPr>
-        <w:spacing w:after="40" w:before="0"/>
-      </w:pPr>
-      <w:r>
-        <w:rPr>
-          <w:rFonts w:ascii="Consolas" w:hAnsi="Consolas"/>
-          <w:sz w:val="18"/>
-        </w:rPr>
-        <w:t>git switch develop</w:t>
-      </w:r>
-    </w:p>
-    <w:p>
-      <w:pPr>
-        <w:spacing w:after="40" w:before="0"/>
-      </w:pPr>
-      <w:r>
-        <w:rPr>
-          <w:rFonts w:ascii="Consolas" w:hAnsi="Consolas"/>
-          <w:sz w:val="18"/>
-        </w:rPr>
-        <w:t>git rev-parse HEAD</w:t>
-      </w:r>
-    </w:p>
-    <w:p>
-      <w:pPr>
-        <w:spacing w:after="40" w:before="0"/>
-      </w:pPr>
-      <w:r>
-        <w:rPr>
-          <w:rFonts w:ascii="Consolas" w:hAnsi="Consolas"/>
-          <w:sz w:val="18"/>
-        </w:rPr>
-        <w:t>corepack enable</w:t>
-      </w:r>
-    </w:p>
-    <w:p>
-      <w:pPr>
-        <w:spacing w:after="40" w:before="0"/>
-      </w:pPr>
-      <w:r>
-        <w:rPr>
-          <w:rFonts w:ascii="Consolas" w:hAnsi="Consolas"/>
-          <w:sz w:val="18"/>
-        </w:rPr>
-        <w:t>corepack pnpm install --frozen-lockfile</w:t>
-      </w:r>
-    </w:p>
-    <w:p>
-      <w:pPr>
-        <w:spacing w:after="40" w:before="0"/>
-      </w:pPr>
-      <w:r>
-        <w:rPr>
-          <w:rFonts w:ascii="Consolas" w:hAnsi="Consolas"/>
-          <w:sz w:val="18"/>
-        </w:rPr>
-        <w:t>py -3.12 -m venv backend/api/.venv</w:t>
-      </w:r>
-    </w:p>
-    <w:p>
-      <w:pPr>
-        <w:spacing w:after="40" w:before="0"/>
-      </w:pPr>
-      <w:r>
-        <w:rPr>
-          <w:rFonts w:ascii="Consolas" w:hAnsi="Consolas"/>
-          <w:sz w:val="18"/>
-        </w:rPr>
-        <w:t>backend/api/.venv/Scripts/python.exe -m pip install -e "backend/api[dev]"</w:t>
-      </w:r>
-    </w:p>
-    <w:p>
-      <w:r>
-        <w:t>Create the root .env, backend/api/.env and frontend/web/.env.local from the corresponding examples only if those destination files do not already exist. Do not overwrite a teammate's environment file. Replace sample signing values and database passwords. Set the backend database URL for the selected runtime, then configure the browser-visible API URL. [R10, R12]</w:t>
+        <w:t>The database address depends on where the API runs. An API on the host uses the database’s published port; an API inside Compose uses the database service name and internal port. Environment values also define the browser-visible API address and upload location. Provider and signing secrets remain outside the client bundle. [R9, R11]</w:t>
       </w:r>
     </w:p>
     <w:tbl>
@@ -29443,16 +29125,11 @@
             </w:tcMar>
           </w:tcPr>
           <w:p>
-            <w:pPr>
-              <w:spacing w:after="20" w:before="20" w:line="245" w:lineRule="auto"/>
-            </w:pPr>
-            <w:r>
-              <w:rPr>
-                <w:b w:val="0"/>
-                <w:color w:val="000000"/>
-                <w:sz w:val="18"/>
-              </w:rPr>
-              <w:t>http://localhost:8000 for a browser on this host; set the actual public API URL before building elsewhere.</w:t>
+            <w:r>
+              <w:rPr>
+                <w:sz w:val="18"/>
+              </w:rPr>
+              <w:t>Browser-visible API address supplied at build time; the current host mapping uses port 3001 for the website.</w:t>
             </w:r>
           </w:p>
         </w:tc>
@@ -29666,270 +29343,123 @@
       </w:pPr>
     </w:p>
     <w:p>
+      <w:pPr>
+        <w:jc w:val="left"/>
+      </w:pPr>
       <w:r>
-        <w:t>A NEXT_PUBLIC value is exposed to browser code. In a production frontend build, changing only the container runtime environment may not replace an API URL already embedded in the client bundle; rebuild with the intended public address. A browser cannot use the Compose-only service name api as though it were a public hostname.</w:t>
+        <w:t>The public API address is supplied when the frontend is built. Moving the app to another host or demonstrating it on a phone requires a reachable address: localhost on a phone refers to the phone itself. The API origin policy must allow the address from which the interface is served.</w:t>
       </w:r>
     </w:p>
     <w:p>
       <w:pPr>
         <w:pStyle w:val="Heading2"/>
+        <w:keepNext/>
       </w:pPr>
       <w:r>
-        <w:t>11 3 Database startup and migrations</w:t>
-      </w:r>
-    </w:p>
-    <w:p>
-      <w:r>
-        <w:t>From the repository root, start only PostgreSQL for host development. The published database port is 5433, while PostgreSQL listens on 5432 inside its container. Configure the host API URL accordingly before running Alembic.</w:t>
+        <w:rPr>
+          <w:color w:val="000000"/>
+        </w:rPr>
+        <w:t>11 3 Database preparation</w:t>
       </w:r>
     </w:p>
     <w:p>
       <w:pPr>
-        <w:spacing w:after="40" w:before="0"/>
+        <w:jc w:val="left"/>
       </w:pPr>
       <w:r>
-        <w:rPr>
-          <w:rFonts w:ascii="Consolas" w:hAnsi="Consolas"/>
-          <w:sz w:val="18"/>
-        </w:rPr>
-        <w:t>docker compose up -d postgres</w:t>
+        <w:t>The database is prepared by applying the Alembic migration history before the application uses it. Compose waits for PostgreSQL health, then runs migrations as part of API startup. Host-based installations apply the same history to their configured database.</w:t>
       </w:r>
     </w:p>
     <w:p>
       <w:pPr>
-        <w:spacing w:after="40" w:before="0"/>
+        <w:jc w:val="left"/>
       </w:pPr>
       <w:r>
-        <w:rPr>
-          <w:rFonts w:ascii="Consolas" w:hAnsi="Consolas"/>
-          <w:sz w:val="18"/>
-        </w:rPr>
-        <w:t>docker compose ps</w:t>
+        <w:t>The current schema head is d7b2a6e14f09. A deployed database should match the application release that uses it. Checking the recorded revision confirms which migration is installed; application checks are also needed to confirm that records and behaviours work as intended.</w:t>
       </w:r>
     </w:p>
     <w:p>
       <w:pPr>
-        <w:spacing w:after="40" w:before="0"/>
+        <w:jc w:val="left"/>
       </w:pPr>
       <w:r>
-        <w:rPr>
-          <w:rFonts w:ascii="Consolas" w:hAnsi="Consolas"/>
-          <w:sz w:val="18"/>
-        </w:rPr>
-        <w:t>Set-Location backend/api</w:t>
-      </w:r>
-    </w:p>
-    <w:p>
-      <w:pPr>
-        <w:spacing w:after="40" w:before="0"/>
-      </w:pPr>
-      <w:r>
-        <w:rPr>
-          <w:rFonts w:ascii="Consolas" w:hAnsi="Consolas"/>
-          <w:sz w:val="18"/>
-        </w:rPr>
-        <w:t>.\.venv\Scripts\python.exe -m alembic heads</w:t>
-      </w:r>
-    </w:p>
-    <w:p>
-      <w:pPr>
-        <w:spacing w:after="40" w:before="0"/>
-      </w:pPr>
-      <w:r>
-        <w:rPr>
-          <w:rFonts w:ascii="Consolas" w:hAnsi="Consolas"/>
-          <w:sz w:val="18"/>
-        </w:rPr>
-        <w:t>.\.venv\Scripts\python.exe -m alembic upgrade heads</w:t>
-      </w:r>
-    </w:p>
-    <w:p>
-      <w:pPr>
-        <w:spacing w:after="40" w:before="0"/>
-      </w:pPr>
-      <w:r>
-        <w:rPr>
-          <w:rFonts w:ascii="Consolas" w:hAnsi="Consolas"/>
-          <w:sz w:val="18"/>
-        </w:rPr>
-        <w:t>.\.venv\Scripts\python.exe -m alembic current</w:t>
-      </w:r>
-    </w:p>
-    <w:p>
-      <w:pPr>
-        <w:spacing w:after="40" w:before="0"/>
-      </w:pPr>
-      <w:r>
-        <w:rPr>
-          <w:rFonts w:ascii="Consolas" w:hAnsi="Consolas"/>
-          <w:sz w:val="18"/>
-        </w:rPr>
-        <w:t>.\.venv\Scripts\python.exe -m alembic check</w:t>
-      </w:r>
-    </w:p>
-    <w:p>
-      <w:r>
-        <w:t>The source head is d7b2a6e14f09. Confirm the installed database reports that revision after a successful upgrade. The check command compares metadata and database structure; investigate any reported differences, especially constraints introduced by migrations but absent from models. Do not generate or apply an unreviewed migration merely to silence a difference.</w:t>
-      </w:r>
-    </w:p>
-    <w:p>
-      <w:r>
-        <w:t>For fresh-install evidence, use a new isolated database and record the complete upgrade result. For upgrade evidence, restore a supported older backup into a separate database, record its revision, apply the migration chain and verify data preservation. Run the test suite only against a dedicated test database; test fixtures use transactions and savepoints and are not a reason to point tests at the shared demonstration database. [R9, R13]</w:t>
+        <w:t>Upgrade verification uses a separate copy of existing data, with backups taken before changes. Checking task and project relationships, completion history, focus records, and time-based reporting helps identify data changes that a structural check alone would miss. [R8, R12]</w:t>
       </w:r>
     </w:p>
     <w:p>
       <w:pPr>
         <w:pStyle w:val="Heading2"/>
+        <w:keepNext/>
       </w:pPr>
       <w:r>
-        <w:t>11 4 Start the application</w:t>
-      </w:r>
-    </w:p>
-    <w:p>
-      <w:r>
-        <w:t>In a backend terminal at backend/api, run the development API. Keep this process running.</w:t>
+        <w:rPr>
+          <w:color w:val="000000"/>
+        </w:rPr>
+        <w:t>11 4 Service topology</w:t>
       </w:r>
     </w:p>
     <w:p>
       <w:pPr>
-        <w:spacing w:after="40" w:before="0"/>
+        <w:jc w:val="left"/>
       </w:pPr>
       <w:r>
-        <w:rPr>
-          <w:rFonts w:ascii="Consolas" w:hAnsi="Consolas"/>
-          <w:sz w:val="18"/>
-        </w:rPr>
-        <w:t>.\.venv\Scripts\python.exe -m uvicorn app.main:app --reload --port 8000</w:t>
-      </w:r>
-    </w:p>
-    <w:p>
-      <w:r>
-        <w:t>In a second terminal at the repository root, run the frontend on port 3001.</w:t>
+        <w:t>In the current Compose configuration, the website is available on host port 3001, mapped to port 3000 in its container. The API is available on port 8000 and PostgreSQL on host port 5433, mapped to port 5432 inside its container. A browser on another device must use a host address reachable from that device. [R9]</w:t>
       </w:r>
     </w:p>
     <w:p>
       <w:pPr>
-        <w:spacing w:after="40" w:before="0"/>
+        <w:jc w:val="left"/>
       </w:pPr>
       <w:r>
-        <w:rPr>
-          <w:rFonts w:ascii="Consolas" w:hAnsi="Consolas"/>
-          <w:sz w:val="18"/>
-        </w:rPr>
-        <w:t>corepack pnpm --filter @ai-smart-scheduling/web dev --port 3001</w:t>
-      </w:r>
-    </w:p>
-    <w:p>
-      <w:r>
-        <w:t>Open http://localhost:3001 for the interface and http://localhost:8000/docs for API documentation. Both API and browser must agree on the configured API address. If the browser runs on another device, localhost refers to that device and must be replaced with a reachable host address together with an appropriate origin policy.</w:t>
-      </w:r>
-    </w:p>
-    <w:p>
-      <w:r>
-        <w:t>For the complete container path, return to the repository root and run the following command after preparing the environment files. This starts the web interface on port 3000, the API on port 8000 and PostgreSQL on host port 5433. The API startup command automatically applies Alembic migrations before Uvicorn starts.</w:t>
-      </w:r>
-    </w:p>
-    <w:p>
-      <w:pPr>
-        <w:spacing w:after="40" w:before="0"/>
-      </w:pPr>
-      <w:r>
-        <w:rPr>
-          <w:rFonts w:ascii="Consolas" w:hAnsi="Consolas"/>
-          <w:sz w:val="18"/>
-        </w:rPr>
-        <w:t>docker compose up --build</w:t>
-      </w:r>
-    </w:p>
-    <w:p>
-      <w:pPr>
-        <w:keepNext/>
-        <w:jc w:val="center"/>
-      </w:pPr>
-      <w:r>
-        <w:drawing>
-          <wp:inline xmlns:a="http://schemas.openxmlformats.org/drawingml/2006/main" xmlns:pic="http://schemas.openxmlformats.org/drawingml/2006/picture">
-            <wp:extent cx="6446520" cy="3692098"/>
-            <wp:docPr id="3" name="Picture 3" descr="Figure 11 1  Current Compose services ports and persistence"/>
-            <wp:cNvGraphicFramePr>
-              <a:graphicFrameLocks noChangeAspect="1"/>
-            </wp:cNvGraphicFramePr>
-            <a:graphic>
-              <a:graphicData uri="http://schemas.openxmlformats.org/drawingml/2006/picture">
-                <pic:pic>
-                  <pic:nvPicPr>
-                    <pic:cNvPr id="0" name="compose-topology.png"/>
-                    <pic:cNvPicPr/>
-                  </pic:nvPicPr>
-                  <pic:blipFill>
-                    <a:blip r:embed="rId12"/>
-                    <a:stretch>
-                      <a:fillRect/>
-                    </a:stretch>
-                  </pic:blipFill>
-                  <pic:spPr>
-                    <a:xfrm>
-                      <a:off x="0" y="0"/>
-                      <a:ext cx="6446520" cy="3692098"/>
-                    </a:xfrm>
-                    <a:prstGeom prst="rect"/>
-                  </pic:spPr>
-                </pic:pic>
-              </a:graphicData>
-            </a:graphic>
-          </wp:inline>
-        </w:drawing>
-      </w:r>
-    </w:p>
-    <w:p>
-      <w:pPr>
-        <w:pStyle w:val="Caption"/>
-      </w:pPr>
-      <w:r>
-        <w:t>Figure 11 1  Current Compose services ports and persistence</w:t>
+        <w:t>PostgreSQL uses a named volume to preserve database records between normal container restarts. The API currently uses development reload and mounted source files; uploaded profile images do not yet have a dedicated persistent volume. The web container builds and serves the Next.js application.</w:t>
       </w:r>
     </w:p>
     <w:p>
       <w:pPr>
         <w:pStyle w:val="Heading2"/>
+        <w:keepNext/>
       </w:pPr>
       <w:r>
-        <w:t>11 5 Prepare the demonstration account</w:t>
-      </w:r>
-    </w:p>
-    <w:p>
-      <w:r>
-        <w:t>With the host API environment configured and migrations complete, run the seed module from backend/api in an isolated demo database. Do not run it against a personal or production dataset.</w:t>
+        <w:rPr>
+          <w:color w:val="000000"/>
+        </w:rPr>
+        <w:t>11 5 Demonstration experience</w:t>
       </w:r>
     </w:p>
     <w:p>
       <w:pPr>
-        <w:spacing w:after="40" w:before="0"/>
+        <w:jc w:val="left"/>
       </w:pPr>
       <w:r>
-        <w:rPr>
-          <w:rFonts w:ascii="Consolas" w:hAnsi="Consolas"/>
-          <w:sz w:val="18"/>
-        </w:rPr>
-        <w:t>.\.venv\Scripts\python.exe -m scripts.seed_mock_data</w:t>
+        <w:t>A prepared account allows an external viewer to explore tasks with different states and dates, calendar placement, focus activity, and progress feedback. A new account provides a complementary view of registration and the app before activity has been recorded.</w:t>
       </w:r>
     </w:p>
     <w:p>
+      <w:pPr>
+        <w:jc w:val="left"/>
+      </w:pPr>
       <w:r>
-        <w:t>The synthetic account is demo@example.com with the script-defined demonstration password DemoPassword123 when the user is first created. These credentials are public demo fixtures and must never be reused for a deployed account. An existing user with that email retains its existing password. A rerun modifies matching fixture records, so prepare or back up the demo state before rehearsal. [R11]</w:t>
+        <w:t>Demonstration records are synthetic and intended for a separate dataset. The prepared experience can include a completed focus session, plant progress, a timezone example, and a project whose tasks return to Inbox when the project is removed. Recreating the dataset changes those records, so it is part of demonstration preparation rather than routine app use. [R10]</w:t>
       </w:r>
     </w:p>
     <w:p>
+      <w:pPr>
+        <w:jc w:val="left"/>
+      </w:pPr>
       <w:r>
-        <w:t>For a complete rehearsal, add a completed focus session through the interface and verify any expected growth point or forest state. Use a separate newly registered account for empty dashboard and no-task scenarios. Prepare a timezone example and a project deletion example without removing the main demonstration data.</w:t>
+        <w:t>The frontend supports desktop and mobile layouts, light and dark workspace themes, and a central account area for personal preferences. Google and Facebook buttons on the authentication pages remain visual demonstrations; they do not establish sign-in through either provider.</w:t>
       </w:r>
     </w:p>
     <w:p>
       <w:pPr>
         <w:pStyle w:val="Heading2"/>
+        <w:keepNext/>
       </w:pPr>
       <w:r>
-        <w:t>11 6 Installation acceptance checks</w:t>
+        <w:rPr>
+          <w:color w:val="000000"/>
+        </w:rPr>
+        <w:t>11 6 Verification scope</w:t>
       </w:r>
     </w:p>
     <w:tbl>
@@ -30036,18 +29566,13 @@
             </w:tcMar>
           </w:tcPr>
           <w:p>
-            <w:pPr>
-              <w:keepNext/>
-              <w:spacing w:after="20" w:before="20" w:line="245" w:lineRule="auto"/>
-              <w:jc w:val="center"/>
-            </w:pPr>
             <w:r>
               <w:rPr>
                 <w:b/>
                 <w:color w:val="FFFFFF"/>
                 <w:sz w:val="18"/>
               </w:rPr>
-              <w:t>Evidence to retain</w:t>
+              <w:t>Purpose of the check</w:t>
             </w:r>
           </w:p>
         </w:tc>
@@ -30141,17 +29666,11 @@
             </w:tcMar>
           </w:tcPr>
           <w:p>
-            <w:pPr>
-              <w:keepNext/>
-              <w:spacing w:after="20" w:before="20" w:line="245" w:lineRule="auto"/>
-            </w:pPr>
-            <w:r>
-              <w:rPr>
-                <w:b w:val="0"/>
-                <w:color w:val="000000"/>
-                <w:sz w:val="18"/>
-              </w:rPr>
-              <w:t>Console output, runtime versions and revision identifier.</w:t>
+            <w:r>
+              <w:rPr>
+                <w:sz w:val="18"/>
+              </w:rPr>
+              <w:t>Confirms service access and the installed database revision.</w:t>
             </w:r>
           </w:p>
         </w:tc>
@@ -30243,16 +29762,11 @@
             </w:tcMar>
           </w:tcPr>
           <w:p>
-            <w:pPr>
-              <w:spacing w:after="20" w:before="20" w:line="245" w:lineRule="auto"/>
-            </w:pPr>
-            <w:r>
-              <w:rPr>
-                <w:b w:val="0"/>
-                <w:color w:val="000000"/>
-                <w:sz w:val="18"/>
-              </w:rPr>
-              <w:t>Test case and result from an isolated environment.</w:t>
+            <w:r>
+              <w:rPr>
+                <w:sz w:val="18"/>
+              </w:rPr>
+              <w:t>Confirms account access and rejection of invalid credentials.</w:t>
             </w:r>
           </w:p>
         </w:tc>
@@ -30344,16 +29858,11 @@
             </w:tcMar>
           </w:tcPr>
           <w:p>
-            <w:pPr>
-              <w:spacing w:after="20" w:before="20" w:line="245" w:lineRule="auto"/>
-            </w:pPr>
-            <w:r>
-              <w:rPr>
-                <w:b w:val="0"/>
-                <w:color w:val="000000"/>
-                <w:sz w:val="18"/>
-              </w:rPr>
-              <w:t>Task identifier and before or after values.</w:t>
+            <w:r>
+              <w:rPr>
+                <w:sz w:val="18"/>
+              </w:rPr>
+              <w:t>Confirms changes are saved beyond the current browser view.</w:t>
             </w:r>
           </w:p>
         </w:tc>
@@ -30445,16 +29954,11 @@
             </w:tcMar>
           </w:tcPr>
           <w:p>
-            <w:pPr>
-              <w:spacing w:after="20" w:before="20" w:line="245" w:lineRule="auto"/>
-            </w:pPr>
-            <w:r>
-              <w:rPr>
-                <w:b w:val="0"/>
-                <w:color w:val="000000"/>
-                <w:sz w:val="18"/>
-              </w:rPr>
-              <w:t>Task count and project_id becoming null.</w:t>
+            <w:r>
+              <w:rPr>
+                <w:sz w:val="18"/>
+              </w:rPr>
+              <w:t>Confirms task preservation when a project is removed.</w:t>
             </w:r>
           </w:p>
         </w:tc>
@@ -30546,16 +30050,11 @@
             </w:tcMar>
           </w:tcPr>
           <w:p>
-            <w:pPr>
-              <w:spacing w:after="20" w:before="20" w:line="245" w:lineRule="auto"/>
-            </w:pPr>
-            <w:r>
-              <w:rPr>
-                <w:b w:val="0"/>
-                <w:color w:val="000000"/>
-                <w:sz w:val="18"/>
-              </w:rPr>
-              <w:t>Request and status without exposing another user's data.</w:t>
+            <w:r>
+              <w:rPr>
+                <w:sz w:val="18"/>
+              </w:rPr>
+              <w:t>Confirms separation between account records.</w:t>
             </w:r>
           </w:p>
         </w:tc>
@@ -30647,16 +30146,11 @@
             </w:tcMar>
           </w:tcPr>
           <w:p>
-            <w:pPr>
-              <w:spacing w:after="20" w:before="20" w:line="245" w:lineRule="auto"/>
-            </w:pPr>
-            <w:r>
-              <w:rPr>
-                <w:b w:val="0"/>
-                <w:color w:val="000000"/>
-                <w:sz w:val="18"/>
-              </w:rPr>
-              <w:t>Chosen timezone, input values and expected totals.</w:t>
+            <w:r>
+              <w:rPr>
+                <w:sz w:val="18"/>
+              </w:rPr>
+              <w:t>Confirms local dates and reporting use the configured timezone.</w:t>
             </w:r>
           </w:p>
         </w:tc>
@@ -30748,16 +30242,11 @@
             </w:tcMar>
           </w:tcPr>
           <w:p>
-            <w:pPr>
-              <w:spacing w:after="20" w:before="20" w:line="245" w:lineRule="auto"/>
-            </w:pPr>
-            <w:r>
-              <w:rPr>
-                <w:b w:val="0"/>
-                <w:color w:val="000000"/>
-                <w:sz w:val="18"/>
-              </w:rPr>
-              <w:t>Session fields, upload cases and persistence check.</w:t>
+            <w:r>
+              <w:rPr>
+                <w:sz w:val="18"/>
+              </w:rPr>
+              <w:t>Confirms activity recording and supported media handling.</w:t>
             </w:r>
           </w:p>
         </w:tc>
@@ -30849,674 +30338,11 @@
             </w:tcMar>
           </w:tcPr>
           <w:p>
-            <w:pPr>
-              <w:spacing w:after="20" w:before="20" w:line="245" w:lineRule="auto"/>
-            </w:pPr>
-            <w:r>
-              <w:rPr>
-                <w:b w:val="0"/>
-                <w:color w:val="000000"/>
-                <w:sz w:val="18"/>
-              </w:rPr>
-              <w:t>Configuration mode and observed result without provider secrets.</w:t>
-            </w:r>
-          </w:p>
-        </w:tc>
-      </w:tr>
-    </w:tbl>
-    <w:p>
-      <w:pPr>
-        <w:spacing w:after="60" w:line="60" w:lineRule="exact"/>
-      </w:pPr>
-    </w:p>
-    <w:p>
-      <w:r>
-        <w:t>Record actual outcomes with Phat's testing chapter. The expected results above are acceptance criteria, not completed test results. A successful source review or migration graph check must not be substituted for a clean installation, data upgrade or restore test.</w:t>
-      </w:r>
-    </w:p>
-    <w:p>
-      <w:pPr>
-        <w:pStyle w:val="Heading2"/>
-      </w:pPr>
-      <w:r>
-        <w:t>11 7 Common installation problems</w:t>
-      </w:r>
-    </w:p>
-    <w:tbl>
-      <w:tblPr>
-        <w:tblW w:type="auto" w:w="0"/>
-        <w:jc w:val="center"/>
-        <w:tblLayout w:type="fixed"/>
-        <w:tblLook w:firstColumn="1" w:firstRow="1" w:lastColumn="0" w:lastRow="0" w:noHBand="0" w:noVBand="1" w:val="04A0"/>
-      </w:tblPr>
-      <w:tblGrid>
-        <w:gridCol w:w="2880"/>
-        <w:gridCol w:w="7344"/>
-      </w:tblGrid>
-      <w:tr>
-        <w:trPr>
-          <w:cantSplit/>
-          <w:tblHeader/>
-        </w:trPr>
-        <w:tc>
-          <w:tcPr>
-            <w:tcW w:type="dxa" w:w="2880"/>
-            <w:vAlign w:val="center"/>
-            <w:shd w:fill="203C50"/>
-            <w:tcBorders>
-              <w:top w:val="single" w:sz="4" w:color="D9D9D9"/>
-              <w:left w:val="single" w:sz="4" w:color="D9D9D9"/>
-              <w:bottom w:val="single" w:sz="4" w:color="D9D9D9"/>
-              <w:right w:val="single" w:sz="4" w:color="D9D9D9"/>
-            </w:tcBorders>
-            <w:tcMar>
-              <w:top w:w="80" w:type="dxa"/>
-              <w:left w:w="80" w:type="dxa"/>
-              <w:bottom w:w="80" w:type="dxa"/>
-              <w:right w:w="80" w:type="dxa"/>
-            </w:tcMar>
-          </w:tcPr>
-          <w:p>
-            <w:pPr>
-              <w:keepNext/>
-              <w:spacing w:after="20" w:before="20" w:line="245" w:lineRule="auto"/>
-              <w:jc w:val="center"/>
-            </w:pPr>
-            <w:r>
-              <w:rPr>
-                <w:b/>
-                <w:color w:val="FFFFFF"/>
-                <w:sz w:val="19"/>
-              </w:rPr>
-              <w:t>Symptom</w:t>
-            </w:r>
-          </w:p>
-        </w:tc>
-        <w:tc>
-          <w:tcPr>
-            <w:tcW w:type="dxa" w:w="7344"/>
-            <w:vAlign w:val="center"/>
-            <w:shd w:fill="203C50"/>
-            <w:tcBorders>
-              <w:top w:val="single" w:sz="4" w:color="D9D9D9"/>
-              <w:left w:val="single" w:sz="4" w:color="D9D9D9"/>
-              <w:bottom w:val="single" w:sz="4" w:color="D9D9D9"/>
-              <w:right w:val="single" w:sz="4" w:color="D9D9D9"/>
-            </w:tcBorders>
-            <w:tcMar>
-              <w:top w:w="80" w:type="dxa"/>
-              <w:left w:w="80" w:type="dxa"/>
-              <w:bottom w:w="80" w:type="dxa"/>
-              <w:right w:w="80" w:type="dxa"/>
-            </w:tcMar>
-          </w:tcPr>
-          <w:p>
-            <w:pPr>
-              <w:keepNext/>
-              <w:spacing w:after="20" w:before="20" w:line="245" w:lineRule="auto"/>
-              <w:jc w:val="center"/>
-            </w:pPr>
-            <w:r>
-              <w:rPr>
-                <w:b/>
-                <w:color w:val="FFFFFF"/>
-                <w:sz w:val="19"/>
-              </w:rPr>
-              <w:t>Likely cause and response</w:t>
-            </w:r>
-          </w:p>
-        </w:tc>
-      </w:tr>
-      <w:tr>
-        <w:trPr>
-          <w:cantSplit/>
-        </w:trPr>
-        <w:tc>
-          <w:tcPr>
-            <w:tcW w:type="dxa" w:w="2880"/>
-            <w:vAlign w:val="center"/>
-            <w:shd w:fill="FFFFFF"/>
-            <w:tcBorders>
-              <w:top w:val="single" w:sz="4" w:color="D9D9D9"/>
-              <w:left w:val="single" w:sz="4" w:color="D9D9D9"/>
-              <w:bottom w:val="single" w:sz="4" w:color="D9D9D9"/>
-              <w:right w:val="single" w:sz="4" w:color="D9D9D9"/>
-            </w:tcBorders>
-            <w:tcMar>
-              <w:top w:w="80" w:type="dxa"/>
-              <w:left w:w="80" w:type="dxa"/>
-              <w:bottom w:w="80" w:type="dxa"/>
-              <w:right w:w="80" w:type="dxa"/>
-            </w:tcMar>
-          </w:tcPr>
-          <w:p>
-            <w:pPr>
-              <w:keepNext/>
-              <w:spacing w:after="20" w:before="20" w:line="245" w:lineRule="auto"/>
-            </w:pPr>
-            <w:r>
-              <w:rPr>
-                <w:b w:val="0"/>
-                <w:color w:val="000000"/>
-                <w:sz w:val="19"/>
-              </w:rPr>
-              <w:t>Database connection refused</w:t>
-            </w:r>
-          </w:p>
-        </w:tc>
-        <w:tc>
-          <w:tcPr>
-            <w:tcW w:type="dxa" w:w="7344"/>
-            <w:vAlign w:val="center"/>
-            <w:shd w:fill="FFFFFF"/>
-            <w:tcBorders>
-              <w:top w:val="single" w:sz="4" w:color="D9D9D9"/>
-              <w:left w:val="single" w:sz="4" w:color="D9D9D9"/>
-              <w:bottom w:val="single" w:sz="4" w:color="D9D9D9"/>
-              <w:right w:val="single" w:sz="4" w:color="D9D9D9"/>
-            </w:tcBorders>
-            <w:tcMar>
-              <w:top w:w="80" w:type="dxa"/>
-              <w:left w:w="80" w:type="dxa"/>
-              <w:bottom w:w="80" w:type="dxa"/>
-              <w:right w:w="80" w:type="dxa"/>
-            </w:tcMar>
-          </w:tcPr>
-          <w:p>
-            <w:pPr>
-              <w:keepNext/>
-              <w:spacing w:after="20" w:before="20" w:line="245" w:lineRule="auto"/>
-            </w:pPr>
-            <w:r>
-              <w:rPr>
-                <w:b w:val="0"/>
-                <w:color w:val="000000"/>
-                <w:sz w:val="19"/>
-              </w:rPr>
-              <w:t>Check postgres container health and host port 5433. Use postgres:5432 only from the Compose network.</w:t>
-            </w:r>
-          </w:p>
-        </w:tc>
-      </w:tr>
-      <w:tr>
-        <w:trPr>
-          <w:cantSplit/>
-        </w:trPr>
-        <w:tc>
-          <w:tcPr>
-            <w:tcW w:type="dxa" w:w="2880"/>
-            <w:vAlign w:val="center"/>
-            <w:shd w:fill="F1F5F8"/>
-            <w:tcBorders>
-              <w:top w:val="single" w:sz="4" w:color="D9D9D9"/>
-              <w:left w:val="single" w:sz="4" w:color="D9D9D9"/>
-              <w:bottom w:val="single" w:sz="4" w:color="D9D9D9"/>
-              <w:right w:val="single" w:sz="4" w:color="D9D9D9"/>
-            </w:tcBorders>
-            <w:tcMar>
-              <w:top w:w="80" w:type="dxa"/>
-              <w:left w:w="80" w:type="dxa"/>
-              <w:bottom w:w="80" w:type="dxa"/>
-              <w:right w:w="80" w:type="dxa"/>
-            </w:tcMar>
-          </w:tcPr>
-          <w:p>
-            <w:pPr>
-              <w:spacing w:after="20" w:before="20" w:line="245" w:lineRule="auto"/>
-            </w:pPr>
-            <w:r>
-              <w:rPr>
-                <w:b w:val="0"/>
-                <w:color w:val="000000"/>
-                <w:sz w:val="19"/>
-              </w:rPr>
-              <w:t>Missing tables or columns</w:t>
-            </w:r>
-          </w:p>
-        </w:tc>
-        <w:tc>
-          <w:tcPr>
-            <w:tcW w:type="dxa" w:w="7344"/>
-            <w:vAlign w:val="center"/>
-            <w:shd w:fill="F1F5F8"/>
-            <w:tcBorders>
-              <w:top w:val="single" w:sz="4" w:color="D9D9D9"/>
-              <w:left w:val="single" w:sz="4" w:color="D9D9D9"/>
-              <w:bottom w:val="single" w:sz="4" w:color="D9D9D9"/>
-              <w:right w:val="single" w:sz="4" w:color="D9D9D9"/>
-            </w:tcBorders>
-            <w:tcMar>
-              <w:top w:w="80" w:type="dxa"/>
-              <w:left w:w="80" w:type="dxa"/>
-              <w:bottom w:w="80" w:type="dxa"/>
-              <w:right w:w="80" w:type="dxa"/>
-            </w:tcMar>
-          </w:tcPr>
-          <w:p>
-            <w:pPr>
-              <w:spacing w:after="20" w:before="20" w:line="245" w:lineRule="auto"/>
-            </w:pPr>
-            <w:r>
-              <w:rPr>
-                <w:b w:val="0"/>
-                <w:color w:val="000000"/>
-                <w:sz w:val="19"/>
-              </w:rPr>
-              <w:t>Check the target DATABASE_URL, then Alembic current and heads. Back up existing data before applying migrations.</w:t>
-            </w:r>
-          </w:p>
-        </w:tc>
-      </w:tr>
-      <w:tr>
-        <w:trPr>
-          <w:cantSplit/>
-        </w:trPr>
-        <w:tc>
-          <w:tcPr>
-            <w:tcW w:type="dxa" w:w="2880"/>
-            <w:vAlign w:val="center"/>
-            <w:shd w:fill="FFFFFF"/>
-            <w:tcBorders>
-              <w:top w:val="single" w:sz="4" w:color="D9D9D9"/>
-              <w:left w:val="single" w:sz="4" w:color="D9D9D9"/>
-              <w:bottom w:val="single" w:sz="4" w:color="D9D9D9"/>
-              <w:right w:val="single" w:sz="4" w:color="D9D9D9"/>
-            </w:tcBorders>
-            <w:tcMar>
-              <w:top w:w="80" w:type="dxa"/>
-              <w:left w:w="80" w:type="dxa"/>
-              <w:bottom w:w="80" w:type="dxa"/>
-              <w:right w:w="80" w:type="dxa"/>
-            </w:tcMar>
-          </w:tcPr>
-          <w:p>
-            <w:pPr>
-              <w:spacing w:after="20" w:before="20" w:line="245" w:lineRule="auto"/>
-            </w:pPr>
-            <w:r>
-              <w:rPr>
-                <w:b w:val="0"/>
-                <w:color w:val="000000"/>
-                <w:sz w:val="19"/>
-              </w:rPr>
-              <w:t>Frontend cannot reach the API</w:t>
-            </w:r>
-          </w:p>
-        </w:tc>
-        <w:tc>
-          <w:tcPr>
-            <w:tcW w:type="dxa" w:w="7344"/>
-            <w:vAlign w:val="center"/>
-            <w:shd w:fill="FFFFFF"/>
-            <w:tcBorders>
-              <w:top w:val="single" w:sz="4" w:color="D9D9D9"/>
-              <w:left w:val="single" w:sz="4" w:color="D9D9D9"/>
-              <w:bottom w:val="single" w:sz="4" w:color="D9D9D9"/>
-              <w:right w:val="single" w:sz="4" w:color="D9D9D9"/>
-            </w:tcBorders>
-            <w:tcMar>
-              <w:top w:w="80" w:type="dxa"/>
-              <w:left w:w="80" w:type="dxa"/>
-              <w:bottom w:w="80" w:type="dxa"/>
-              <w:right w:w="80" w:type="dxa"/>
-            </w:tcMar>
-          </w:tcPr>
-          <w:p>
-            <w:pPr>
-              <w:spacing w:after="20" w:before="20" w:line="245" w:lineRule="auto"/>
-            </w:pPr>
-            <w:r>
-              <w:rPr>
-                <w:b w:val="0"/>
-                <w:color w:val="000000"/>
-                <w:sz w:val="19"/>
-              </w:rPr>
-              <w:t>Confirm API port 8000, NEXT_PUBLIC_API_URL and browser reachability. Rebuild a production bundle after changing its public API URL.</w:t>
-            </w:r>
-          </w:p>
-        </w:tc>
-      </w:tr>
-      <w:tr>
-        <w:trPr>
-          <w:cantSplit/>
-        </w:trPr>
-        <w:tc>
-          <w:tcPr>
-            <w:tcW w:type="dxa" w:w="2880"/>
-            <w:vAlign w:val="center"/>
-            <w:shd w:fill="F1F5F8"/>
-            <w:tcBorders>
-              <w:top w:val="single" w:sz="4" w:color="D9D9D9"/>
-              <w:left w:val="single" w:sz="4" w:color="D9D9D9"/>
-              <w:bottom w:val="single" w:sz="4" w:color="D9D9D9"/>
-              <w:right w:val="single" w:sz="4" w:color="D9D9D9"/>
-            </w:tcBorders>
-            <w:tcMar>
-              <w:top w:w="80" w:type="dxa"/>
-              <w:left w:w="80" w:type="dxa"/>
-              <w:bottom w:w="80" w:type="dxa"/>
-              <w:right w:w="80" w:type="dxa"/>
-            </w:tcMar>
-          </w:tcPr>
-          <w:p>
-            <w:pPr>
-              <w:spacing w:after="20" w:before="20" w:line="245" w:lineRule="auto"/>
-            </w:pPr>
-            <w:r>
-              <w:rPr>
-                <w:b w:val="0"/>
-                <w:color w:val="000000"/>
-                <w:sz w:val="19"/>
-              </w:rPr>
-              <w:t>Could not validate credentials</w:t>
-            </w:r>
-          </w:p>
-        </w:tc>
-        <w:tc>
-          <w:tcPr>
-            <w:tcW w:type="dxa" w:w="7344"/>
-            <w:vAlign w:val="center"/>
-            <w:shd w:fill="F1F5F8"/>
-            <w:tcBorders>
-              <w:top w:val="single" w:sz="4" w:color="D9D9D9"/>
-              <w:left w:val="single" w:sz="4" w:color="D9D9D9"/>
-              <w:bottom w:val="single" w:sz="4" w:color="D9D9D9"/>
-              <w:right w:val="single" w:sz="4" w:color="D9D9D9"/>
-            </w:tcBorders>
-            <w:tcMar>
-              <w:top w:w="80" w:type="dxa"/>
-              <w:left w:w="80" w:type="dxa"/>
-              <w:bottom w:w="80" w:type="dxa"/>
-              <w:right w:w="80" w:type="dxa"/>
-            </w:tcMar>
-          </w:tcPr>
-          <w:p>
-            <w:pPr>
-              <w:spacing w:after="20" w:before="20" w:line="245" w:lineRule="auto"/>
-            </w:pPr>
-            <w:r>
-              <w:rPr>
-                <w:b w:val="0"/>
-                <w:color w:val="000000"/>
-                <w:sz w:val="19"/>
-              </w:rPr>
-              <w:t>Check expiry, signing configuration and account activity. Clear the stale browser session and sign in again; do not disable token verification.</w:t>
-            </w:r>
-          </w:p>
-        </w:tc>
-      </w:tr>
-      <w:tr>
-        <w:trPr>
-          <w:cantSplit/>
-        </w:trPr>
-        <w:tc>
-          <w:tcPr>
-            <w:tcW w:type="dxa" w:w="2880"/>
-            <w:vAlign w:val="center"/>
-            <w:shd w:fill="FFFFFF"/>
-            <w:tcBorders>
-              <w:top w:val="single" w:sz="4" w:color="D9D9D9"/>
-              <w:left w:val="single" w:sz="4" w:color="D9D9D9"/>
-              <w:bottom w:val="single" w:sz="4" w:color="D9D9D9"/>
-              <w:right w:val="single" w:sz="4" w:color="D9D9D9"/>
-            </w:tcBorders>
-            <w:tcMar>
-              <w:top w:w="80" w:type="dxa"/>
-              <w:left w:w="80" w:type="dxa"/>
-              <w:bottom w:w="80" w:type="dxa"/>
-              <w:right w:w="80" w:type="dxa"/>
-            </w:tcMar>
-          </w:tcPr>
-          <w:p>
-            <w:pPr>
-              <w:spacing w:after="20" w:before="20" w:line="245" w:lineRule="auto"/>
-            </w:pPr>
-            <w:r>
-              <w:rPr>
-                <w:b w:val="0"/>
-                <w:color w:val="000000"/>
-                <w:sz w:val="19"/>
-              </w:rPr>
-              <w:t>Seeded account password fails</w:t>
-            </w:r>
-          </w:p>
-        </w:tc>
-        <w:tc>
-          <w:tcPr>
-            <w:tcW w:type="dxa" w:w="7344"/>
-            <w:vAlign w:val="center"/>
-            <w:shd w:fill="FFFFFF"/>
-            <w:tcBorders>
-              <w:top w:val="single" w:sz="4" w:color="D9D9D9"/>
-              <w:left w:val="single" w:sz="4" w:color="D9D9D9"/>
-              <w:bottom w:val="single" w:sz="4" w:color="D9D9D9"/>
-              <w:right w:val="single" w:sz="4" w:color="D9D9D9"/>
-            </w:tcBorders>
-            <w:tcMar>
-              <w:top w:w="80" w:type="dxa"/>
-              <w:left w:w="80" w:type="dxa"/>
-              <w:bottom w:w="80" w:type="dxa"/>
-              <w:right w:w="80" w:type="dxa"/>
-            </w:tcMar>
-          </w:tcPr>
-          <w:p>
-            <w:pPr>
-              <w:spacing w:after="20" w:before="20" w:line="245" w:lineRule="auto"/>
-            </w:pPr>
-            <w:r>
-              <w:rPr>
-                <w:b w:val="0"/>
-                <w:color w:val="000000"/>
-                <w:sz w:val="19"/>
-              </w:rPr>
-              <w:t>An existing demo user is reused without resetting its password. Use the known isolated fixture account or recreate only the disposable demo environment.</w:t>
-            </w:r>
-          </w:p>
-        </w:tc>
-      </w:tr>
-      <w:tr>
-        <w:trPr>
-          <w:cantSplit/>
-        </w:trPr>
-        <w:tc>
-          <w:tcPr>
-            <w:tcW w:type="dxa" w:w="2880"/>
-            <w:vAlign w:val="center"/>
-            <w:shd w:fill="F1F5F8"/>
-            <w:tcBorders>
-              <w:top w:val="single" w:sz="4" w:color="D9D9D9"/>
-              <w:left w:val="single" w:sz="4" w:color="D9D9D9"/>
-              <w:bottom w:val="single" w:sz="4" w:color="D9D9D9"/>
-              <w:right w:val="single" w:sz="4" w:color="D9D9D9"/>
-            </w:tcBorders>
-            <w:tcMar>
-              <w:top w:w="80" w:type="dxa"/>
-              <w:left w:w="80" w:type="dxa"/>
-              <w:bottom w:w="80" w:type="dxa"/>
-              <w:right w:w="80" w:type="dxa"/>
-            </w:tcMar>
-          </w:tcPr>
-          <w:p>
-            <w:pPr>
-              <w:spacing w:after="20" w:before="20" w:line="245" w:lineRule="auto"/>
-            </w:pPr>
-            <w:r>
-              <w:rPr>
-                <w:b w:val="0"/>
-                <w:color w:val="000000"/>
-                <w:sz w:val="19"/>
-              </w:rPr>
-              <w:t>Avatar disappears after container replacement</w:t>
-            </w:r>
-          </w:p>
-        </w:tc>
-        <w:tc>
-          <w:tcPr>
-            <w:tcW w:type="dxa" w:w="7344"/>
-            <w:vAlign w:val="center"/>
-            <w:shd w:fill="F1F5F8"/>
-            <w:tcBorders>
-              <w:top w:val="single" w:sz="4" w:color="D9D9D9"/>
-              <w:left w:val="single" w:sz="4" w:color="D9D9D9"/>
-              <w:bottom w:val="single" w:sz="4" w:color="D9D9D9"/>
-              <w:right w:val="single" w:sz="4" w:color="D9D9D9"/>
-            </w:tcBorders>
-            <w:tcMar>
-              <w:top w:w="80" w:type="dxa"/>
-              <w:left w:w="80" w:type="dxa"/>
-              <w:bottom w:w="80" w:type="dxa"/>
-              <w:right w:w="80" w:type="dxa"/>
-            </w:tcMar>
-          </w:tcPr>
-          <w:p>
-            <w:pPr>
-              <w:spacing w:after="20" w:before="20" w:line="245" w:lineRule="auto"/>
-            </w:pPr>
-            <w:r>
-              <w:rPr>
-                <w:b w:val="0"/>
-                <w:color w:val="000000"/>
-                <w:sz w:val="19"/>
-              </w:rPr>
-              <w:t>The current Compose file has no upload volume. Restore media from backup and add durable upload storage before relying on container recreation.</w:t>
-            </w:r>
-          </w:p>
-        </w:tc>
-      </w:tr>
-      <w:tr>
-        <w:trPr>
-          <w:cantSplit/>
-        </w:trPr>
-        <w:tc>
-          <w:tcPr>
-            <w:tcW w:type="dxa" w:w="2880"/>
-            <w:vAlign w:val="center"/>
-            <w:shd w:fill="FFFFFF"/>
-            <w:tcBorders>
-              <w:top w:val="single" w:sz="4" w:color="D9D9D9"/>
-              <w:left w:val="single" w:sz="4" w:color="D9D9D9"/>
-              <w:bottom w:val="single" w:sz="4" w:color="D9D9D9"/>
-              <w:right w:val="single" w:sz="4" w:color="D9D9D9"/>
-            </w:tcBorders>
-            <w:tcMar>
-              <w:top w:w="80" w:type="dxa"/>
-              <w:left w:w="80" w:type="dxa"/>
-              <w:bottom w:w="80" w:type="dxa"/>
-              <w:right w:w="80" w:type="dxa"/>
-            </w:tcMar>
-          </w:tcPr>
-          <w:p>
-            <w:pPr>
-              <w:spacing w:after="20" w:before="20" w:line="245" w:lineRule="auto"/>
-            </w:pPr>
-            <w:r>
-              <w:rPr>
-                <w:b w:val="0"/>
-                <w:color w:val="000000"/>
-                <w:sz w:val="19"/>
-              </w:rPr>
-              <w:t>AI unavailable or limited</w:t>
-            </w:r>
-          </w:p>
-        </w:tc>
-        <w:tc>
-          <w:tcPr>
-            <w:tcW w:type="dxa" w:w="7344"/>
-            <w:vAlign w:val="center"/>
-            <w:shd w:fill="FFFFFF"/>
-            <w:tcBorders>
-              <w:top w:val="single" w:sz="4" w:color="D9D9D9"/>
-              <w:left w:val="single" w:sz="4" w:color="D9D9D9"/>
-              <w:bottom w:val="single" w:sz="4" w:color="D9D9D9"/>
-              <w:right w:val="single" w:sz="4" w:color="D9D9D9"/>
-            </w:tcBorders>
-            <w:tcMar>
-              <w:top w:w="80" w:type="dxa"/>
-              <w:left w:w="80" w:type="dxa"/>
-              <w:bottom w:w="80" w:type="dxa"/>
-              <w:right w:w="80" w:type="dxa"/>
-            </w:tcMar>
-          </w:tcPr>
-          <w:p>
-            <w:pPr>
-              <w:spacing w:after="20" w:before="20" w:line="245" w:lineRule="auto"/>
-            </w:pPr>
-            <w:r>
-              <w:rPr>
-                <w:b w:val="0"/>
-                <w:color w:val="000000"/>
-                <w:sz w:val="19"/>
-              </w:rPr>
-              <w:t>Check server-side AI configuration, provider credentials and request limits. Do not expose the key in frontend configuration.</w:t>
-            </w:r>
-          </w:p>
-        </w:tc>
-      </w:tr>
-      <w:tr>
-        <w:trPr>
-          <w:cantSplit/>
-        </w:trPr>
-        <w:tc>
-          <w:tcPr>
-            <w:tcW w:type="dxa" w:w="2880"/>
-            <w:vAlign w:val="center"/>
-            <w:shd w:fill="F1F5F8"/>
-            <w:tcBorders>
-              <w:top w:val="single" w:sz="4" w:color="D9D9D9"/>
-              <w:left w:val="single" w:sz="4" w:color="D9D9D9"/>
-              <w:bottom w:val="single" w:sz="4" w:color="D9D9D9"/>
-              <w:right w:val="single" w:sz="4" w:color="D9D9D9"/>
-            </w:tcBorders>
-            <w:tcMar>
-              <w:top w:w="80" w:type="dxa"/>
-              <w:left w:w="80" w:type="dxa"/>
-              <w:bottom w:w="80" w:type="dxa"/>
-              <w:right w:w="80" w:type="dxa"/>
-            </w:tcMar>
-          </w:tcPr>
-          <w:p>
-            <w:pPr>
-              <w:spacing w:after="20" w:before="20" w:line="245" w:lineRule="auto"/>
-            </w:pPr>
-            <w:r>
-              <w:rPr>
-                <w:b w:val="0"/>
-                <w:color w:val="000000"/>
-                <w:sz w:val="19"/>
-              </w:rPr>
-              <w:t>Port already in use</w:t>
-            </w:r>
-          </w:p>
-        </w:tc>
-        <w:tc>
-          <w:tcPr>
-            <w:tcW w:type="dxa" w:w="7344"/>
-            <w:vAlign w:val="center"/>
-            <w:shd w:fill="F1F5F8"/>
-            <w:tcBorders>
-              <w:top w:val="single" w:sz="4" w:color="D9D9D9"/>
-              <w:left w:val="single" w:sz="4" w:color="D9D9D9"/>
-              <w:bottom w:val="single" w:sz="4" w:color="D9D9D9"/>
-              <w:right w:val="single" w:sz="4" w:color="D9D9D9"/>
-            </w:tcBorders>
-            <w:tcMar>
-              <w:top w:w="80" w:type="dxa"/>
-              <w:left w:w="80" w:type="dxa"/>
-              <w:bottom w:w="80" w:type="dxa"/>
-              <w:right w:w="80" w:type="dxa"/>
-            </w:tcMar>
-          </w:tcPr>
-          <w:p>
-            <w:pPr>
-              <w:spacing w:after="20" w:before="20" w:line="245" w:lineRule="auto"/>
-            </w:pPr>
-            <w:r>
-              <w:rPr>
-                <w:b w:val="0"/>
-                <w:color w:val="000000"/>
-                <w:sz w:val="19"/>
-              </w:rPr>
-              <w:t>Check existing processes or containers and choose a nonconflicting frontend port; update the browser address and relevant origin configuration.</w:t>
+            <w:r>
+              <w:rPr>
+                <w:sz w:val="18"/>
+              </w:rPr>
+              <w:t>Confirms behaviour when AI is available, disabled, or unavailable.</w:t>
             </w:r>
           </w:p>
         </w:tc>
@@ -31529,1244 +30355,226 @@
     </w:p>
     <w:p>
       <w:pPr>
-        <w:pStyle w:val="Heading2"/>
+        <w:jc w:val="left"/>
       </w:pPr>
       <w:r>
-        <w:t>11 8 Deployment and production readiness</w:t>
-      </w:r>
-    </w:p>
-    <w:p>
-      <w:r>
-        <w:t>The supplied Compose file is a local deployment configuration. PostgreSQL uses a named volume and an explicit health check. The API runs migrations before startup, but also enables reload and mounts source code. The frontend is built and started as a Next.js application. These facts do not establish a hosted production service, an automated deployment pipeline or an availability target.</w:t>
-      </w:r>
-    </w:p>
-    <w:p>
-      <w:r>
-        <w:t>Before public deployment, choose the hosting environment and public API address, remove development reload and source mounts, configure HTTPS and a restricted CORS allowlist, and isolate PostgreSQL from public access. Add durable storage for avatars and verify both database and media backups. Use a controlled release migration step rather than allowing multiple new API instances to compete for schema changes. Record the exact dependencies, runtime versions and image identifiers used for that deployment.</w:t>
-      </w:r>
-    </w:p>
-    <w:p>
-      <w:r>
-        <w:t>The root pnpm lockfile supports a frozen frontend install. Backend reproducibility needs additional attention because the Dockerfile currently installs declared dependency ranges through pip rather than enforcing an existing lockfile. The handover should resolve and validate that build policy before claiming that a later rebuild must install identical packages. No CI pipeline or production hosting result is established by the current local configuration. [R10, R12]</w:t>
+        <w:t>These checks describe the behaviours an installation needs to demonstrate. They are verification criteria, rather than evidence that every check has already passed. Runtime installation, migration, and recovery results should be reported separately from the architecture description.</w:t>
       </w:r>
     </w:p>
     <w:p>
       <w:pPr>
         <w:pStyle w:val="Heading2"/>
+        <w:keepNext/>
       </w:pPr>
       <w:r>
-        <w:t>11 9 Backups recovery and maintenance</w:t>
-      </w:r>
-    </w:p>
-    <w:p>
-      <w:r>
-        <w:t>Back up PostgreSQL before migration or substantial demonstration-data changes, and keep a separate copy of the upload directory. Database backups contain account details, task content and password hashes and must be access-restricted. Record backup time, application revision, database revision and media location together. Define retention and deletion rules for backups as well as for the live database.</w:t>
-      </w:r>
-    </w:p>
-    <w:p>
-      <w:r>
-        <w:t>For a container database, the following example creates a PostgreSQL custom-format dump inside the container and copies it to a local backups directory that the operator creates beforehand. This avoids treating binary dump data as a PowerShell text stream. The dump file is an internal recovery artefact, not part of the submission.</w:t>
+        <w:rPr>
+          <w:color w:val="000000"/>
+        </w:rPr>
+        <w:t>11 7 Public deployment requirements</w:t>
       </w:r>
     </w:p>
     <w:p>
       <w:pPr>
-        <w:spacing w:after="40" w:before="0"/>
+        <w:jc w:val="left"/>
       </w:pPr>
       <w:r>
-        <w:rPr>
-          <w:rFonts w:ascii="Consolas" w:hAnsi="Consolas"/>
-          <w:sz w:val="18"/>
-        </w:rPr>
-        <w:t>docker compose exec -T postgres sh -lc '</w:t>
+        <w:t>The supplied Compose environment supports local development and demonstrations. It defines service startup, database health, and persistent database storage, but does not by itself establish a hosted service, an automated deployment pipeline, or an availability target.</w:t>
       </w:r>
     </w:p>
     <w:p>
       <w:pPr>
-        <w:spacing w:after="40" w:before="0"/>
+        <w:jc w:val="left"/>
       </w:pPr>
       <w:r>
-        <w:rPr>
-          <w:rFonts w:ascii="Consolas" w:hAnsi="Consolas"/>
-          <w:sz w:val="18"/>
-        </w:rPr>
-        <w:t xml:space="preserve">  pg_dump -U "$POSTGRES_USER" -d "$POSTGRES_DB" \</w:t>
+        <w:t>A public deployment needs a hosting environment, HTTPS, a reachable API address, a restricted origin policy, and private database access. Development reload and source mounts should be removed, and avatar storage made durable. Database migrations should run through a controlled release step so multiple API instances do not compete to update the schema.</w:t>
       </w:r>
     </w:p>
     <w:p>
       <w:pPr>
-        <w:spacing w:after="40" w:before="0"/>
+        <w:jc w:val="left"/>
       </w:pPr>
       <w:r>
-        <w:rPr>
-          <w:rFonts w:ascii="Consolas" w:hAnsi="Consolas"/>
-          <w:sz w:val="18"/>
-        </w:rPr>
-        <w:t xml:space="preserve">  -Fc -f /tmp/chrono-backup.dump'</w:t>
-      </w:r>
-    </w:p>
-    <w:p>
-      <w:pPr>
-        <w:spacing w:after="40" w:before="0"/>
-      </w:pPr>
-      <w:r>
-        <w:rPr>
-          <w:rFonts w:ascii="Consolas" w:hAnsi="Consolas"/>
-          <w:sz w:val="18"/>
-        </w:rPr>
-        <w:t>docker compose cp postgres:/tmp/chrono-backup.dump ./backups/chrono-backup.dump</w:t>
-      </w:r>
-    </w:p>
-    <w:p>
-      <w:r>
-        <w:t>A recovery drill should restore that dump into a separate empty recovery database using pg_restore, restore the matching media copy, apply only required subsequent migrations and run the acceptance checks against the restored instance. Verify ownership, project-to-Inbox behaviour, task totals, focus history and media URLs before considering any switch to the restored service. Do not overwrite the live demonstration database during a drill.</w:t>
-      </w:r>
-    </w:p>
-    <w:p>
-      <w:r>
-        <w:t>Normal docker compose down preserves the named PostgreSQL volume, but commands that remove volumes can destroy the stored database. API uploads are not protected by that volume and may disappear when the API container is replaced. A database-only backup cannot reconstruct those files. Avatar cleanup must distinguish currently referenced images from orphan files and follow an agreed retention policy.</w:t>
-      </w:r>
-    </w:p>
-    <w:p>
-      <w:r>
-        <w:t>Routine maintenance should check disk space, connectivity, migration state, API errors and upload growth. Review orphan images, protect telemetry and test dependency updates. Keep schema changes in reviewed migrations. If an upgrade fails, stop mutations, preserve logs and recover from a verified backup or a reviewed corrective migration; a downgrade cannot recover deleted data.</w:t>
+        <w:t>The pnpm lockfile supports a frozen frontend installation. Equivalent backend reproducibility requires a validated dependency-locking policy, together with recorded runtime and image versions. Backup and media recovery also need to be verified in the selected hosting environment. [R9, R11]</w:t>
       </w:r>
     </w:p>
     <w:p>
       <w:pPr>
         <w:pStyle w:val="Heading2"/>
+        <w:keepNext/>
       </w:pPr>
       <w:r>
-        <w:t>11 10 Source code handover</w:t>
+        <w:rPr>
+          <w:color w:val="000000"/>
+        </w:rPr>
+        <w:t>11 8 Data recovery and maintenance</w:t>
       </w:r>
     </w:p>
     <w:p>
+      <w:pPr>
+        <w:jc w:val="left"/>
+      </w:pPr>
       <w:r>
-        <w:t>Minh's handover joins the source code, schema history, environment examples and operating instructions into a reproducible package. The receiving member should be able to start the same application without using the original developer's environment files or personal database. A clean checkout and a second-member installation are the final practical checks.</w:t>
+        <w:t>Recovery covers two stores: PostgreSQL records and uploaded profile images. Database backups include account details, task content, and password hashes, so they require restricted access. Recording the application version, schema revision, backup time, and matching media copy helps keep recovery consistent.</w:t>
       </w:r>
     </w:p>
-    <w:tbl>
-      <w:tblPr>
-        <w:tblW w:type="auto" w:w="0"/>
-        <w:jc w:val="center"/>
-        <w:tblLayout w:type="fixed"/>
-        <w:tblLook w:firstColumn="1" w:firstRow="1" w:lastColumn="0" w:lastRow="0" w:noHBand="0" w:noVBand="1" w:val="04A0"/>
-      </w:tblPr>
-      <w:tblGrid>
-        <w:gridCol w:w="1872"/>
-        <w:gridCol w:w="5328"/>
-        <w:gridCol w:w="3024"/>
-      </w:tblGrid>
-      <w:tr>
-        <w:trPr>
-          <w:cantSplit/>
-          <w:tblHeader/>
-        </w:trPr>
-        <w:tc>
-          <w:tcPr>
-            <w:tcW w:type="dxa" w:w="1872"/>
-            <w:vAlign w:val="center"/>
-            <w:shd w:fill="203C50"/>
-            <w:tcBorders>
-              <w:top w:val="single" w:sz="4" w:color="D9D9D9"/>
-              <w:left w:val="single" w:sz="4" w:color="D9D9D9"/>
-              <w:bottom w:val="single" w:sz="4" w:color="D9D9D9"/>
-              <w:right w:val="single" w:sz="4" w:color="D9D9D9"/>
-            </w:tcBorders>
-            <w:tcMar>
-              <w:top w:w="80" w:type="dxa"/>
-              <w:left w:w="80" w:type="dxa"/>
-              <w:bottom w:w="80" w:type="dxa"/>
-              <w:right w:w="80" w:type="dxa"/>
-            </w:tcMar>
-          </w:tcPr>
-          <w:p>
-            <w:pPr>
-              <w:keepNext/>
-              <w:spacing w:after="20" w:before="20" w:line="245" w:lineRule="auto"/>
-              <w:jc w:val="center"/>
-            </w:pPr>
-            <w:r>
-              <w:rPr>
-                <w:b/>
-                <w:color w:val="FFFFFF"/>
-                <w:sz w:val="18"/>
-              </w:rPr>
-              <w:t>Handover item</w:t>
-            </w:r>
-          </w:p>
-        </w:tc>
-        <w:tc>
-          <w:tcPr>
-            <w:tcW w:type="dxa" w:w="5328"/>
-            <w:vAlign w:val="center"/>
-            <w:shd w:fill="203C50"/>
-            <w:tcBorders>
-              <w:top w:val="single" w:sz="4" w:color="D9D9D9"/>
-              <w:left w:val="single" w:sz="4" w:color="D9D9D9"/>
-              <w:bottom w:val="single" w:sz="4" w:color="D9D9D9"/>
-              <w:right w:val="single" w:sz="4" w:color="D9D9D9"/>
-            </w:tcBorders>
-            <w:tcMar>
-              <w:top w:w="80" w:type="dxa"/>
-              <w:left w:w="80" w:type="dxa"/>
-              <w:bottom w:w="80" w:type="dxa"/>
-              <w:right w:w="80" w:type="dxa"/>
-            </w:tcMar>
-          </w:tcPr>
-          <w:p>
-            <w:pPr>
-              <w:keepNext/>
-              <w:spacing w:after="20" w:before="20" w:line="245" w:lineRule="auto"/>
-              <w:jc w:val="center"/>
-            </w:pPr>
-            <w:r>
-              <w:rPr>
-                <w:b/>
-                <w:color w:val="FFFFFF"/>
-                <w:sz w:val="18"/>
-              </w:rPr>
-              <w:t>Required content or action</w:t>
-            </w:r>
-          </w:p>
-        </w:tc>
-        <w:tc>
-          <w:tcPr>
-            <w:tcW w:type="dxa" w:w="3024"/>
-            <w:vAlign w:val="center"/>
-            <w:shd w:fill="203C50"/>
-            <w:tcBorders>
-              <w:top w:val="single" w:sz="4" w:color="D9D9D9"/>
-              <w:left w:val="single" w:sz="4" w:color="D9D9D9"/>
-              <w:bottom w:val="single" w:sz="4" w:color="D9D9D9"/>
-              <w:right w:val="single" w:sz="4" w:color="D9D9D9"/>
-            </w:tcBorders>
-            <w:tcMar>
-              <w:top w:w="80" w:type="dxa"/>
-              <w:left w:w="80" w:type="dxa"/>
-              <w:bottom w:w="80" w:type="dxa"/>
-              <w:right w:w="80" w:type="dxa"/>
-            </w:tcMar>
-          </w:tcPr>
-          <w:p>
-            <w:pPr>
-              <w:keepNext/>
-              <w:spacing w:after="20" w:before="20" w:line="245" w:lineRule="auto"/>
-              <w:jc w:val="center"/>
-            </w:pPr>
-            <w:r>
-              <w:rPr>
-                <w:b/>
-                <w:color w:val="FFFFFF"/>
-                <w:sz w:val="18"/>
-              </w:rPr>
-              <w:t>Status for final submission</w:t>
-            </w:r>
-          </w:p>
-        </w:tc>
-      </w:tr>
-      <w:tr>
-        <w:trPr>
-          <w:cantSplit/>
-        </w:trPr>
-        <w:tc>
-          <w:tcPr>
-            <w:tcW w:type="dxa" w:w="1872"/>
-            <w:vAlign w:val="center"/>
-            <w:shd w:fill="FFFFFF"/>
-            <w:tcBorders>
-              <w:top w:val="single" w:sz="4" w:color="D9D9D9"/>
-              <w:left w:val="single" w:sz="4" w:color="D9D9D9"/>
-              <w:bottom w:val="single" w:sz="4" w:color="D9D9D9"/>
-              <w:right w:val="single" w:sz="4" w:color="D9D9D9"/>
-            </w:tcBorders>
-            <w:tcMar>
-              <w:top w:w="80" w:type="dxa"/>
-              <w:left w:w="80" w:type="dxa"/>
-              <w:bottom w:w="80" w:type="dxa"/>
-              <w:right w:w="80" w:type="dxa"/>
-            </w:tcMar>
-          </w:tcPr>
-          <w:p>
-            <w:pPr>
-              <w:keepNext/>
-              <w:spacing w:after="20" w:before="20" w:line="245" w:lineRule="auto"/>
-            </w:pPr>
-            <w:r>
-              <w:rPr>
-                <w:b w:val="0"/>
-                <w:color w:val="000000"/>
-                <w:sz w:val="18"/>
-              </w:rPr>
-              <w:t>Release identity</w:t>
-            </w:r>
-          </w:p>
-        </w:tc>
-        <w:tc>
-          <w:tcPr>
-            <w:tcW w:type="dxa" w:w="5328"/>
-            <w:vAlign w:val="center"/>
-            <w:shd w:fill="FFFFFF"/>
-            <w:tcBorders>
-              <w:top w:val="single" w:sz="4" w:color="D9D9D9"/>
-              <w:left w:val="single" w:sz="4" w:color="D9D9D9"/>
-              <w:bottom w:val="single" w:sz="4" w:color="D9D9D9"/>
-              <w:right w:val="single" w:sz="4" w:color="D9D9D9"/>
-            </w:tcBorders>
-            <w:tcMar>
-              <w:top w:w="80" w:type="dxa"/>
-              <w:left w:w="80" w:type="dxa"/>
-              <w:bottom w:w="80" w:type="dxa"/>
-              <w:right w:w="80" w:type="dxa"/>
-            </w:tcMar>
-          </w:tcPr>
-          <w:p>
-            <w:pPr>
-              <w:keepNext/>
-              <w:spacing w:after="20" w:before="20" w:line="245" w:lineRule="auto"/>
-            </w:pPr>
-            <w:r>
-              <w:rPr>
-                <w:b w:val="0"/>
-                <w:color w:val="000000"/>
-                <w:sz w:val="18"/>
-              </w:rPr>
-              <w:t>Agree the final commit or tag with Nhan after local changes are reviewed and included.</w:t>
-            </w:r>
-          </w:p>
-        </w:tc>
-        <w:tc>
-          <w:tcPr>
-            <w:tcW w:type="dxa" w:w="3024"/>
-            <w:vAlign w:val="center"/>
-            <w:shd w:fill="FFFFFF"/>
-            <w:tcBorders>
-              <w:top w:val="single" w:sz="4" w:color="D9D9D9"/>
-              <w:left w:val="single" w:sz="4" w:color="D9D9D9"/>
-              <w:bottom w:val="single" w:sz="4" w:color="D9D9D9"/>
-              <w:right w:val="single" w:sz="4" w:color="D9D9D9"/>
-            </w:tcBorders>
-            <w:tcMar>
-              <w:top w:w="80" w:type="dxa"/>
-              <w:left w:w="80" w:type="dxa"/>
-              <w:bottom w:w="80" w:type="dxa"/>
-              <w:right w:w="80" w:type="dxa"/>
-            </w:tcMar>
-          </w:tcPr>
-          <w:p>
-            <w:pPr>
-              <w:keepNext/>
-              <w:spacing w:after="20" w:before="20" w:line="245" w:lineRule="auto"/>
-            </w:pPr>
-            <w:r>
-              <w:rPr>
-                <w:b w:val="0"/>
-                <w:color w:val="000000"/>
-                <w:sz w:val="18"/>
-              </w:rPr>
-              <w:t>Record at release freeze.</w:t>
-            </w:r>
-          </w:p>
-        </w:tc>
-      </w:tr>
-      <w:tr>
-        <w:trPr>
-          <w:cantSplit/>
-        </w:trPr>
-        <w:tc>
-          <w:tcPr>
-            <w:tcW w:type="dxa" w:w="1872"/>
-            <w:vAlign w:val="center"/>
-            <w:shd w:fill="F1F5F8"/>
-            <w:tcBorders>
-              <w:top w:val="single" w:sz="4" w:color="D9D9D9"/>
-              <w:left w:val="single" w:sz="4" w:color="D9D9D9"/>
-              <w:bottom w:val="single" w:sz="4" w:color="D9D9D9"/>
-              <w:right w:val="single" w:sz="4" w:color="D9D9D9"/>
-            </w:tcBorders>
-            <w:tcMar>
-              <w:top w:w="80" w:type="dxa"/>
-              <w:left w:w="80" w:type="dxa"/>
-              <w:bottom w:w="80" w:type="dxa"/>
-              <w:right w:w="80" w:type="dxa"/>
-            </w:tcMar>
-          </w:tcPr>
-          <w:p>
-            <w:pPr>
-              <w:spacing w:after="20" w:before="20" w:line="245" w:lineRule="auto"/>
-            </w:pPr>
-            <w:r>
-              <w:rPr>
-                <w:b w:val="0"/>
-                <w:color w:val="000000"/>
-                <w:sz w:val="18"/>
-              </w:rPr>
-              <w:t>Source and dependencies</w:t>
-            </w:r>
-          </w:p>
-        </w:tc>
-        <w:tc>
-          <w:tcPr>
-            <w:tcW w:type="dxa" w:w="5328"/>
-            <w:vAlign w:val="center"/>
-            <w:shd w:fill="F1F5F8"/>
-            <w:tcBorders>
-              <w:top w:val="single" w:sz="4" w:color="D9D9D9"/>
-              <w:left w:val="single" w:sz="4" w:color="D9D9D9"/>
-              <w:bottom w:val="single" w:sz="4" w:color="D9D9D9"/>
-              <w:right w:val="single" w:sz="4" w:color="D9D9D9"/>
-            </w:tcBorders>
-            <w:tcMar>
-              <w:top w:w="80" w:type="dxa"/>
-              <w:left w:w="80" w:type="dxa"/>
-              <w:bottom w:w="80" w:type="dxa"/>
-              <w:right w:w="80" w:type="dxa"/>
-            </w:tcMar>
-          </w:tcPr>
-          <w:p>
-            <w:pPr>
-              <w:spacing w:after="20" w:before="20" w:line="245" w:lineRule="auto"/>
-            </w:pPr>
-            <w:r>
-              <w:rPr>
-                <w:b w:val="0"/>
-                <w:color w:val="000000"/>
-                <w:sz w:val="18"/>
-              </w:rPr>
-              <w:t>Include application source, package manifests, pnpm lockfile, Python dependency or lock policy and Dockerfiles.</w:t>
-            </w:r>
-          </w:p>
-        </w:tc>
-        <w:tc>
-          <w:tcPr>
-            <w:tcW w:type="dxa" w:w="3024"/>
-            <w:vAlign w:val="center"/>
-            <w:shd w:fill="F1F5F8"/>
-            <w:tcBorders>
-              <w:top w:val="single" w:sz="4" w:color="D9D9D9"/>
-              <w:left w:val="single" w:sz="4" w:color="D9D9D9"/>
-              <w:bottom w:val="single" w:sz="4" w:color="D9D9D9"/>
-              <w:right w:val="single" w:sz="4" w:color="D9D9D9"/>
-            </w:tcBorders>
-            <w:tcMar>
-              <w:top w:w="80" w:type="dxa"/>
-              <w:left w:w="80" w:type="dxa"/>
-              <w:bottom w:w="80" w:type="dxa"/>
-              <w:right w:w="80" w:type="dxa"/>
-            </w:tcMar>
-          </w:tcPr>
-          <w:p>
-            <w:pPr>
-              <w:spacing w:after="20" w:before="20" w:line="245" w:lineRule="auto"/>
-            </w:pPr>
-            <w:r>
-              <w:rPr>
-                <w:b w:val="0"/>
-                <w:color w:val="000000"/>
-                <w:sz w:val="18"/>
-              </w:rPr>
-              <w:t>Source present; resolved build must be recorded.</w:t>
-            </w:r>
-          </w:p>
-        </w:tc>
-      </w:tr>
-      <w:tr>
-        <w:trPr>
-          <w:cantSplit/>
-        </w:trPr>
-        <w:tc>
-          <w:tcPr>
-            <w:tcW w:type="dxa" w:w="1872"/>
-            <w:vAlign w:val="center"/>
-            <w:shd w:fill="FFFFFF"/>
-            <w:tcBorders>
-              <w:top w:val="single" w:sz="4" w:color="D9D9D9"/>
-              <w:left w:val="single" w:sz="4" w:color="D9D9D9"/>
-              <w:bottom w:val="single" w:sz="4" w:color="D9D9D9"/>
-              <w:right w:val="single" w:sz="4" w:color="D9D9D9"/>
-            </w:tcBorders>
-            <w:tcMar>
-              <w:top w:w="80" w:type="dxa"/>
-              <w:left w:w="80" w:type="dxa"/>
-              <w:bottom w:w="80" w:type="dxa"/>
-              <w:right w:w="80" w:type="dxa"/>
-            </w:tcMar>
-          </w:tcPr>
-          <w:p>
-            <w:pPr>
-              <w:spacing w:after="20" w:before="20" w:line="245" w:lineRule="auto"/>
-            </w:pPr>
-            <w:r>
-              <w:rPr>
-                <w:b w:val="0"/>
-                <w:color w:val="000000"/>
-                <w:sz w:val="18"/>
-              </w:rPr>
-              <w:t>Schema history</w:t>
-            </w:r>
-          </w:p>
-        </w:tc>
-        <w:tc>
-          <w:tcPr>
-            <w:tcW w:type="dxa" w:w="5328"/>
-            <w:vAlign w:val="center"/>
-            <w:shd w:fill="FFFFFF"/>
-            <w:tcBorders>
-              <w:top w:val="single" w:sz="4" w:color="D9D9D9"/>
-              <w:left w:val="single" w:sz="4" w:color="D9D9D9"/>
-              <w:bottom w:val="single" w:sz="4" w:color="D9D9D9"/>
-              <w:right w:val="single" w:sz="4" w:color="D9D9D9"/>
-            </w:tcBorders>
-            <w:tcMar>
-              <w:top w:w="80" w:type="dxa"/>
-              <w:left w:w="80" w:type="dxa"/>
-              <w:bottom w:w="80" w:type="dxa"/>
-              <w:right w:w="80" w:type="dxa"/>
-            </w:tcMar>
-          </w:tcPr>
-          <w:p>
-            <w:pPr>
-              <w:spacing w:after="20" w:before="20" w:line="245" w:lineRule="auto"/>
-            </w:pPr>
-            <w:r>
-              <w:rPr>
-                <w:b w:val="0"/>
-                <w:color w:val="000000"/>
-                <w:sz w:val="18"/>
-              </w:rPr>
-              <w:t>Retain all 32 migrations and verify the final head against a clean installation and supported upgrade copy.</w:t>
-            </w:r>
-          </w:p>
-        </w:tc>
-        <w:tc>
-          <w:tcPr>
-            <w:tcW w:type="dxa" w:w="3024"/>
-            <w:vAlign w:val="center"/>
-            <w:shd w:fill="FFFFFF"/>
-            <w:tcBorders>
-              <w:top w:val="single" w:sz="4" w:color="D9D9D9"/>
-              <w:left w:val="single" w:sz="4" w:color="D9D9D9"/>
-              <w:bottom w:val="single" w:sz="4" w:color="D9D9D9"/>
-              <w:right w:val="single" w:sz="4" w:color="D9D9D9"/>
-            </w:tcBorders>
-            <w:tcMar>
-              <w:top w:w="80" w:type="dxa"/>
-              <w:left w:w="80" w:type="dxa"/>
-              <w:bottom w:w="80" w:type="dxa"/>
-              <w:right w:w="80" w:type="dxa"/>
-            </w:tcMar>
-          </w:tcPr>
-          <w:p>
-            <w:pPr>
-              <w:spacing w:after="20" w:before="20" w:line="245" w:lineRule="auto"/>
-            </w:pPr>
-            <w:r>
-              <w:rPr>
-                <w:b w:val="0"/>
-                <w:color w:val="000000"/>
-                <w:sz w:val="18"/>
-              </w:rPr>
-              <w:t>Static graph checked; runtime evidence required.</w:t>
-            </w:r>
-          </w:p>
-        </w:tc>
-      </w:tr>
-      <w:tr>
-        <w:trPr>
-          <w:cantSplit/>
-        </w:trPr>
-        <w:tc>
-          <w:tcPr>
-            <w:tcW w:type="dxa" w:w="1872"/>
-            <w:vAlign w:val="center"/>
-            <w:shd w:fill="F1F5F8"/>
-            <w:tcBorders>
-              <w:top w:val="single" w:sz="4" w:color="D9D9D9"/>
-              <w:left w:val="single" w:sz="4" w:color="D9D9D9"/>
-              <w:bottom w:val="single" w:sz="4" w:color="D9D9D9"/>
-              <w:right w:val="single" w:sz="4" w:color="D9D9D9"/>
-            </w:tcBorders>
-            <w:tcMar>
-              <w:top w:w="80" w:type="dxa"/>
-              <w:left w:w="80" w:type="dxa"/>
-              <w:bottom w:w="80" w:type="dxa"/>
-              <w:right w:w="80" w:type="dxa"/>
-            </w:tcMar>
-          </w:tcPr>
-          <w:p>
-            <w:pPr>
-              <w:spacing w:after="20" w:before="20" w:line="245" w:lineRule="auto"/>
-            </w:pPr>
-            <w:r>
-              <w:rPr>
-                <w:b w:val="0"/>
-                <w:color w:val="000000"/>
-                <w:sz w:val="18"/>
-              </w:rPr>
-              <w:t>Environment templates</w:t>
-            </w:r>
-          </w:p>
-        </w:tc>
-        <w:tc>
-          <w:tcPr>
-            <w:tcW w:type="dxa" w:w="5328"/>
-            <w:vAlign w:val="center"/>
-            <w:shd w:fill="F1F5F8"/>
-            <w:tcBorders>
-              <w:top w:val="single" w:sz="4" w:color="D9D9D9"/>
-              <w:left w:val="single" w:sz="4" w:color="D9D9D9"/>
-              <w:bottom w:val="single" w:sz="4" w:color="D9D9D9"/>
-              <w:right w:val="single" w:sz="4" w:color="D9D9D9"/>
-            </w:tcBorders>
-            <w:tcMar>
-              <w:top w:w="80" w:type="dxa"/>
-              <w:left w:w="80" w:type="dxa"/>
-              <w:bottom w:w="80" w:type="dxa"/>
-              <w:right w:w="80" w:type="dxa"/>
-            </w:tcMar>
-          </w:tcPr>
-          <w:p>
-            <w:pPr>
-              <w:spacing w:after="20" w:before="20" w:line="245" w:lineRule="auto"/>
-            </w:pPr>
-            <w:r>
-              <w:rPr>
-                <w:b w:val="0"/>
-                <w:color w:val="000000"/>
-                <w:sz w:val="18"/>
-              </w:rPr>
-              <w:t>Provide placeholders and explain URLs, secret generation, optional AI configuration and ports.</w:t>
-            </w:r>
-          </w:p>
-        </w:tc>
-        <w:tc>
-          <w:tcPr>
-            <w:tcW w:type="dxa" w:w="3024"/>
-            <w:vAlign w:val="center"/>
-            <w:shd w:fill="F1F5F8"/>
-            <w:tcBorders>
-              <w:top w:val="single" w:sz="4" w:color="D9D9D9"/>
-              <w:left w:val="single" w:sz="4" w:color="D9D9D9"/>
-              <w:bottom w:val="single" w:sz="4" w:color="D9D9D9"/>
-              <w:right w:val="single" w:sz="4" w:color="D9D9D9"/>
-            </w:tcBorders>
-            <w:tcMar>
-              <w:top w:w="80" w:type="dxa"/>
-              <w:left w:w="80" w:type="dxa"/>
-              <w:bottom w:w="80" w:type="dxa"/>
-              <w:right w:w="80" w:type="dxa"/>
-            </w:tcMar>
-          </w:tcPr>
-          <w:p>
-            <w:pPr>
-              <w:spacing w:after="20" w:before="20" w:line="245" w:lineRule="auto"/>
-            </w:pPr>
-            <w:r>
-              <w:rPr>
-                <w:b w:val="0"/>
-                <w:color w:val="000000"/>
-                <w:sz w:val="18"/>
-              </w:rPr>
-              <w:t>Review example values and remove reusable secrets.</w:t>
-            </w:r>
-          </w:p>
-        </w:tc>
-      </w:tr>
-      <w:tr>
-        <w:trPr>
-          <w:cantSplit/>
-        </w:trPr>
-        <w:tc>
-          <w:tcPr>
-            <w:tcW w:type="dxa" w:w="1872"/>
-            <w:vAlign w:val="center"/>
-            <w:shd w:fill="FFFFFF"/>
-            <w:tcBorders>
-              <w:top w:val="single" w:sz="4" w:color="D9D9D9"/>
-              <w:left w:val="single" w:sz="4" w:color="D9D9D9"/>
-              <w:bottom w:val="single" w:sz="4" w:color="D9D9D9"/>
-              <w:right w:val="single" w:sz="4" w:color="D9D9D9"/>
-            </w:tcBorders>
-            <w:tcMar>
-              <w:top w:w="80" w:type="dxa"/>
-              <w:left w:w="80" w:type="dxa"/>
-              <w:bottom w:w="80" w:type="dxa"/>
-              <w:right w:w="80" w:type="dxa"/>
-            </w:tcMar>
-          </w:tcPr>
-          <w:p>
-            <w:pPr>
-              <w:spacing w:after="20" w:before="20" w:line="245" w:lineRule="auto"/>
-            </w:pPr>
-            <w:r>
-              <w:rPr>
-                <w:b w:val="0"/>
-                <w:color w:val="000000"/>
-                <w:sz w:val="18"/>
-              </w:rPr>
-              <w:t>Demo and clean states</w:t>
-            </w:r>
-          </w:p>
-        </w:tc>
-        <w:tc>
-          <w:tcPr>
-            <w:tcW w:type="dxa" w:w="5328"/>
-            <w:vAlign w:val="center"/>
-            <w:shd w:fill="FFFFFF"/>
-            <w:tcBorders>
-              <w:top w:val="single" w:sz="4" w:color="D9D9D9"/>
-              <w:left w:val="single" w:sz="4" w:color="D9D9D9"/>
-              <w:bottom w:val="single" w:sz="4" w:color="D9D9D9"/>
-              <w:right w:val="single" w:sz="4" w:color="D9D9D9"/>
-            </w:tcBorders>
-            <w:tcMar>
-              <w:top w:w="80" w:type="dxa"/>
-              <w:left w:w="80" w:type="dxa"/>
-              <w:bottom w:w="80" w:type="dxa"/>
-              <w:right w:w="80" w:type="dxa"/>
-            </w:tcMar>
-          </w:tcPr>
-          <w:p>
-            <w:pPr>
-              <w:spacing w:after="20" w:before="20" w:line="245" w:lineRule="auto"/>
-            </w:pPr>
-            <w:r>
-              <w:rPr>
-                <w:b w:val="0"/>
-                <w:color w:val="000000"/>
-                <w:sz w:val="18"/>
-              </w:rPr>
-              <w:t>Provide isolated seed instructions, synthetic login and prepared focus or forest scenarios; retain a blank account.</w:t>
-            </w:r>
-          </w:p>
-        </w:tc>
-        <w:tc>
-          <w:tcPr>
-            <w:tcW w:type="dxa" w:w="3024"/>
-            <w:vAlign w:val="center"/>
-            <w:shd w:fill="FFFFFF"/>
-            <w:tcBorders>
-              <w:top w:val="single" w:sz="4" w:color="D9D9D9"/>
-              <w:left w:val="single" w:sz="4" w:color="D9D9D9"/>
-              <w:bottom w:val="single" w:sz="4" w:color="D9D9D9"/>
-              <w:right w:val="single" w:sz="4" w:color="D9D9D9"/>
-            </w:tcBorders>
-            <w:tcMar>
-              <w:top w:w="80" w:type="dxa"/>
-              <w:left w:w="80" w:type="dxa"/>
-              <w:bottom w:w="80" w:type="dxa"/>
-              <w:right w:w="80" w:type="dxa"/>
-            </w:tcMar>
-          </w:tcPr>
-          <w:p>
-            <w:pPr>
-              <w:spacing w:after="20" w:before="20" w:line="245" w:lineRule="auto"/>
-            </w:pPr>
-            <w:r>
-              <w:rPr>
-                <w:b w:val="0"/>
-                <w:color w:val="000000"/>
-                <w:sz w:val="18"/>
-              </w:rPr>
-              <w:t>Seed source present; rehearse and record results.</w:t>
-            </w:r>
-          </w:p>
-        </w:tc>
-      </w:tr>
-      <w:tr>
-        <w:trPr>
-          <w:cantSplit/>
-        </w:trPr>
-        <w:tc>
-          <w:tcPr>
-            <w:tcW w:type="dxa" w:w="1872"/>
-            <w:vAlign w:val="center"/>
-            <w:shd w:fill="F1F5F8"/>
-            <w:tcBorders>
-              <w:top w:val="single" w:sz="4" w:color="D9D9D9"/>
-              <w:left w:val="single" w:sz="4" w:color="D9D9D9"/>
-              <w:bottom w:val="single" w:sz="4" w:color="D9D9D9"/>
-              <w:right w:val="single" w:sz="4" w:color="D9D9D9"/>
-            </w:tcBorders>
-            <w:tcMar>
-              <w:top w:w="80" w:type="dxa"/>
-              <w:left w:w="80" w:type="dxa"/>
-              <w:bottom w:w="80" w:type="dxa"/>
-              <w:right w:w="80" w:type="dxa"/>
-            </w:tcMar>
-          </w:tcPr>
-          <w:p>
-            <w:pPr>
-              <w:spacing w:after="20" w:before="20" w:line="245" w:lineRule="auto"/>
-            </w:pPr>
-            <w:r>
-              <w:rPr>
-                <w:b w:val="0"/>
-                <w:color w:val="000000"/>
-                <w:sz w:val="18"/>
-              </w:rPr>
-              <w:t>Recovery package</w:t>
-            </w:r>
-          </w:p>
-        </w:tc>
-        <w:tc>
-          <w:tcPr>
-            <w:tcW w:type="dxa" w:w="5328"/>
-            <w:vAlign w:val="center"/>
-            <w:shd w:fill="F1F5F8"/>
-            <w:tcBorders>
-              <w:top w:val="single" w:sz="4" w:color="D9D9D9"/>
-              <w:left w:val="single" w:sz="4" w:color="D9D9D9"/>
-              <w:bottom w:val="single" w:sz="4" w:color="D9D9D9"/>
-              <w:right w:val="single" w:sz="4" w:color="D9D9D9"/>
-            </w:tcBorders>
-            <w:tcMar>
-              <w:top w:w="80" w:type="dxa"/>
-              <w:left w:w="80" w:type="dxa"/>
-              <w:bottom w:w="80" w:type="dxa"/>
-              <w:right w:w="80" w:type="dxa"/>
-            </w:tcMar>
-          </w:tcPr>
-          <w:p>
-            <w:pPr>
-              <w:spacing w:after="20" w:before="20" w:line="245" w:lineRule="auto"/>
-            </w:pPr>
-            <w:r>
-              <w:rPr>
-                <w:b w:val="0"/>
-                <w:color w:val="000000"/>
-                <w:sz w:val="18"/>
-              </w:rPr>
-              <w:t>Document DB and media backup locations, retention and a restore drill.</w:t>
-            </w:r>
-          </w:p>
-        </w:tc>
-        <w:tc>
-          <w:tcPr>
-            <w:tcW w:type="dxa" w:w="3024"/>
-            <w:vAlign w:val="center"/>
-            <w:shd w:fill="F1F5F8"/>
-            <w:tcBorders>
-              <w:top w:val="single" w:sz="4" w:color="D9D9D9"/>
-              <w:left w:val="single" w:sz="4" w:color="D9D9D9"/>
-              <w:bottom w:val="single" w:sz="4" w:color="D9D9D9"/>
-              <w:right w:val="single" w:sz="4" w:color="D9D9D9"/>
-            </w:tcBorders>
-            <w:tcMar>
-              <w:top w:w="80" w:type="dxa"/>
-              <w:left w:w="80" w:type="dxa"/>
-              <w:bottom w:w="80" w:type="dxa"/>
-              <w:right w:w="80" w:type="dxa"/>
-            </w:tcMar>
-          </w:tcPr>
-          <w:p>
-            <w:pPr>
-              <w:spacing w:after="20" w:before="20" w:line="245" w:lineRule="auto"/>
-            </w:pPr>
-            <w:r>
-              <w:rPr>
-                <w:b w:val="0"/>
-                <w:color w:val="000000"/>
-                <w:sz w:val="18"/>
-              </w:rPr>
-              <w:t>Create and verify before operational handover.</w:t>
-            </w:r>
-          </w:p>
-        </w:tc>
-      </w:tr>
-      <w:tr>
-        <w:trPr>
-          <w:cantSplit/>
-        </w:trPr>
-        <w:tc>
-          <w:tcPr>
-            <w:tcW w:type="dxa" w:w="1872"/>
-            <w:vAlign w:val="center"/>
-            <w:shd w:fill="FFFFFF"/>
-            <w:tcBorders>
-              <w:top w:val="single" w:sz="4" w:color="D9D9D9"/>
-              <w:left w:val="single" w:sz="4" w:color="D9D9D9"/>
-              <w:bottom w:val="single" w:sz="4" w:color="D9D9D9"/>
-              <w:right w:val="single" w:sz="4" w:color="D9D9D9"/>
-            </w:tcBorders>
-            <w:tcMar>
-              <w:top w:w="80" w:type="dxa"/>
-              <w:left w:w="80" w:type="dxa"/>
-              <w:bottom w:w="80" w:type="dxa"/>
-              <w:right w:w="80" w:type="dxa"/>
-            </w:tcMar>
-          </w:tcPr>
-          <w:p>
-            <w:pPr>
-              <w:spacing w:after="20" w:before="20" w:line="245" w:lineRule="auto"/>
-            </w:pPr>
-            <w:r>
-              <w:rPr>
-                <w:b w:val="0"/>
-                <w:color w:val="000000"/>
-                <w:sz w:val="18"/>
-              </w:rPr>
-              <w:t>Security review</w:t>
-            </w:r>
-          </w:p>
-        </w:tc>
-        <w:tc>
-          <w:tcPr>
-            <w:tcW w:type="dxa" w:w="5328"/>
-            <w:vAlign w:val="center"/>
-            <w:shd w:fill="FFFFFF"/>
-            <w:tcBorders>
-              <w:top w:val="single" w:sz="4" w:color="D9D9D9"/>
-              <w:left w:val="single" w:sz="4" w:color="D9D9D9"/>
-              <w:bottom w:val="single" w:sz="4" w:color="D9D9D9"/>
-              <w:right w:val="single" w:sz="4" w:color="D9D9D9"/>
-            </w:tcBorders>
-            <w:tcMar>
-              <w:top w:w="80" w:type="dxa"/>
-              <w:left w:w="80" w:type="dxa"/>
-              <w:bottom w:w="80" w:type="dxa"/>
-              <w:right w:w="80" w:type="dxa"/>
-            </w:tcMar>
-          </w:tcPr>
-          <w:p>
-            <w:pPr>
-              <w:spacing w:after="20" w:before="20" w:line="245" w:lineRule="auto"/>
-            </w:pPr>
-            <w:r>
-              <w:rPr>
-                <w:b w:val="0"/>
-                <w:color w:val="000000"/>
-                <w:sz w:val="18"/>
-              </w:rPr>
-              <w:t>Exclude personal data, real environment files, tokens, keys and private dumps from the submission.</w:t>
-            </w:r>
-          </w:p>
-        </w:tc>
-        <w:tc>
-          <w:tcPr>
-            <w:tcW w:type="dxa" w:w="3024"/>
-            <w:vAlign w:val="center"/>
-            <w:shd w:fill="FFFFFF"/>
-            <w:tcBorders>
-              <w:top w:val="single" w:sz="4" w:color="D9D9D9"/>
-              <w:left w:val="single" w:sz="4" w:color="D9D9D9"/>
-              <w:bottom w:val="single" w:sz="4" w:color="D9D9D9"/>
-              <w:right w:val="single" w:sz="4" w:color="D9D9D9"/>
-            </w:tcBorders>
-            <w:tcMar>
-              <w:top w:w="80" w:type="dxa"/>
-              <w:left w:w="80" w:type="dxa"/>
-              <w:bottom w:w="80" w:type="dxa"/>
-              <w:right w:w="80" w:type="dxa"/>
-            </w:tcMar>
-          </w:tcPr>
-          <w:p>
-            <w:pPr>
-              <w:spacing w:after="20" w:before="20" w:line="245" w:lineRule="auto"/>
-            </w:pPr>
-            <w:r>
-              <w:rPr>
-                <w:b w:val="0"/>
-                <w:color w:val="000000"/>
-                <w:sz w:val="18"/>
-              </w:rPr>
-              <w:t>Complete review before distribution.</w:t>
-            </w:r>
-          </w:p>
-        </w:tc>
-      </w:tr>
-      <w:tr>
-        <w:trPr>
-          <w:cantSplit/>
-        </w:trPr>
-        <w:tc>
-          <w:tcPr>
-            <w:tcW w:type="dxa" w:w="1872"/>
-            <w:vAlign w:val="center"/>
-            <w:shd w:fill="F1F5F8"/>
-            <w:tcBorders>
-              <w:top w:val="single" w:sz="4" w:color="D9D9D9"/>
-              <w:left w:val="single" w:sz="4" w:color="D9D9D9"/>
-              <w:bottom w:val="single" w:sz="4" w:color="D9D9D9"/>
-              <w:right w:val="single" w:sz="4" w:color="D9D9D9"/>
-            </w:tcBorders>
-            <w:tcMar>
-              <w:top w:w="80" w:type="dxa"/>
-              <w:left w:w="80" w:type="dxa"/>
-              <w:bottom w:w="80" w:type="dxa"/>
-              <w:right w:w="80" w:type="dxa"/>
-            </w:tcMar>
-          </w:tcPr>
-          <w:p>
-            <w:pPr>
-              <w:spacing w:after="20" w:before="20" w:line="245" w:lineRule="auto"/>
-            </w:pPr>
-            <w:r>
-              <w:rPr>
-                <w:b w:val="0"/>
-                <w:color w:val="000000"/>
-                <w:sz w:val="18"/>
-              </w:rPr>
-              <w:t>Independent reproduction</w:t>
-            </w:r>
-          </w:p>
-        </w:tc>
-        <w:tc>
-          <w:tcPr>
-            <w:tcW w:type="dxa" w:w="5328"/>
-            <w:vAlign w:val="center"/>
-            <w:shd w:fill="F1F5F8"/>
-            <w:tcBorders>
-              <w:top w:val="single" w:sz="4" w:color="D9D9D9"/>
-              <w:left w:val="single" w:sz="4" w:color="D9D9D9"/>
-              <w:bottom w:val="single" w:sz="4" w:color="D9D9D9"/>
-              <w:right w:val="single" w:sz="4" w:color="D9D9D9"/>
-            </w:tcBorders>
-            <w:tcMar>
-              <w:top w:w="80" w:type="dxa"/>
-              <w:left w:w="80" w:type="dxa"/>
-              <w:bottom w:w="80" w:type="dxa"/>
-              <w:right w:w="80" w:type="dxa"/>
-            </w:tcMar>
-          </w:tcPr>
-          <w:p>
-            <w:pPr>
-              <w:spacing w:after="20" w:before="20" w:line="245" w:lineRule="auto"/>
-            </w:pPr>
-            <w:r>
-              <w:rPr>
-                <w:b w:val="0"/>
-                <w:color w:val="000000"/>
-                <w:sz w:val="18"/>
-              </w:rPr>
-              <w:t>Ask another member to install from the final source package and record issues and fixes.</w:t>
-            </w:r>
-          </w:p>
-        </w:tc>
-        <w:tc>
-          <w:tcPr>
-            <w:tcW w:type="dxa" w:w="3024"/>
-            <w:vAlign w:val="center"/>
-            <w:shd w:fill="F1F5F8"/>
-            <w:tcBorders>
-              <w:top w:val="single" w:sz="4" w:color="D9D9D9"/>
-              <w:left w:val="single" w:sz="4" w:color="D9D9D9"/>
-              <w:bottom w:val="single" w:sz="4" w:color="D9D9D9"/>
-              <w:right w:val="single" w:sz="4" w:color="D9D9D9"/>
-            </w:tcBorders>
-            <w:tcMar>
-              <w:top w:w="80" w:type="dxa"/>
-              <w:left w:w="80" w:type="dxa"/>
-              <w:bottom w:w="80" w:type="dxa"/>
-              <w:right w:w="80" w:type="dxa"/>
-            </w:tcMar>
-          </w:tcPr>
-          <w:p>
-            <w:pPr>
-              <w:spacing w:after="20" w:before="20" w:line="245" w:lineRule="auto"/>
-            </w:pPr>
-            <w:r>
-              <w:rPr>
-                <w:b w:val="0"/>
-                <w:color w:val="000000"/>
-                <w:sz w:val="18"/>
-              </w:rPr>
-              <w:t>Attach actual reproduction result.</w:t>
-            </w:r>
-          </w:p>
-        </w:tc>
-      </w:tr>
-      <w:tr>
-        <w:trPr>
-          <w:cantSplit/>
-        </w:trPr>
-        <w:tc>
-          <w:tcPr>
-            <w:tcW w:type="dxa" w:w="1872"/>
-            <w:vAlign w:val="center"/>
-            <w:shd w:fill="FFFFFF"/>
-            <w:tcBorders>
-              <w:top w:val="single" w:sz="4" w:color="D9D9D9"/>
-              <w:left w:val="single" w:sz="4" w:color="D9D9D9"/>
-              <w:bottom w:val="single" w:sz="4" w:color="D9D9D9"/>
-              <w:right w:val="single" w:sz="4" w:color="D9D9D9"/>
-            </w:tcBorders>
-            <w:tcMar>
-              <w:top w:w="80" w:type="dxa"/>
-              <w:left w:w="80" w:type="dxa"/>
-              <w:bottom w:w="80" w:type="dxa"/>
-              <w:right w:w="80" w:type="dxa"/>
-            </w:tcMar>
-          </w:tcPr>
-          <w:p>
-            <w:pPr>
-              <w:spacing w:after="20" w:before="20" w:line="245" w:lineRule="auto"/>
-            </w:pPr>
-            <w:r>
-              <w:rPr>
-                <w:b w:val="0"/>
-                <w:color w:val="000000"/>
-                <w:sz w:val="18"/>
-              </w:rPr>
-              <w:t>Report integration</w:t>
-            </w:r>
-          </w:p>
-        </w:tc>
-        <w:tc>
-          <w:tcPr>
-            <w:tcW w:type="dxa" w:w="5328"/>
-            <w:vAlign w:val="center"/>
-            <w:shd w:fill="FFFFFF"/>
-            <w:tcBorders>
-              <w:top w:val="single" w:sz="4" w:color="D9D9D9"/>
-              <w:left w:val="single" w:sz="4" w:color="D9D9D9"/>
-              <w:bottom w:val="single" w:sz="4" w:color="D9D9D9"/>
-              <w:right w:val="single" w:sz="4" w:color="D9D9D9"/>
-            </w:tcBorders>
-            <w:tcMar>
-              <w:top w:w="80" w:type="dxa"/>
-              <w:left w:w="80" w:type="dxa"/>
-              <w:bottom w:w="80" w:type="dxa"/>
-              <w:right w:w="80" w:type="dxa"/>
-            </w:tcMar>
-          </w:tcPr>
-          <w:p>
-            <w:pPr>
-              <w:spacing w:after="20" w:before="20" w:line="245" w:lineRule="auto"/>
-            </w:pPr>
-            <w:r>
-              <w:rPr>
-                <w:b w:val="0"/>
-                <w:color w:val="000000"/>
-                <w:sz w:val="18"/>
-              </w:rPr>
-              <w:t>Supply database and deployment facts to Chapters 4 and 13 and merge shared Chapters 5 and 9.</w:t>
-            </w:r>
-          </w:p>
-        </w:tc>
-        <w:tc>
-          <w:tcPr>
-            <w:tcW w:type="dxa" w:w="3024"/>
-            <w:vAlign w:val="center"/>
-            <w:shd w:fill="FFFFFF"/>
-            <w:tcBorders>
-              <w:top w:val="single" w:sz="4" w:color="D9D9D9"/>
-              <w:left w:val="single" w:sz="4" w:color="D9D9D9"/>
-              <w:bottom w:val="single" w:sz="4" w:color="D9D9D9"/>
-              <w:right w:val="single" w:sz="4" w:color="D9D9D9"/>
-            </w:tcBorders>
-            <w:tcMar>
-              <w:top w:w="80" w:type="dxa"/>
-              <w:left w:w="80" w:type="dxa"/>
-              <w:bottom w:w="80" w:type="dxa"/>
-              <w:right w:w="80" w:type="dxa"/>
-            </w:tcMar>
-          </w:tcPr>
-          <w:p>
-            <w:pPr>
-              <w:spacing w:after="20" w:before="20" w:line="245" w:lineRule="auto"/>
-            </w:pPr>
-            <w:r>
-              <w:rPr>
-                <w:b w:val="0"/>
-                <w:color w:val="000000"/>
-                <w:sz w:val="18"/>
-              </w:rPr>
-              <w:t>Confirm with Nhan, Duy and the team.</w:t>
-            </w:r>
-          </w:p>
-        </w:tc>
-      </w:tr>
-    </w:tbl>
     <w:p>
       <w:pPr>
-        <w:spacing w:after="60" w:line="60" w:lineRule="exact"/>
+        <w:jc w:val="left"/>
       </w:pPr>
+      <w:r>
+        <w:t>A recovery check restores the database and corresponding media into a separate environment, then verifies ownership, task totals, focus history, project-to-Inbox behaviour, and image availability. The restore procedure needs to be tested before a backup can be relied on for service recovery.</w:t>
+      </w:r>
     </w:p>
     <w:p>
+      <w:pPr>
+        <w:jc w:val="left"/>
+      </w:pPr>
       <w:r>
-        <w:br w:type="page"/>
+        <w:t>The PostgreSQL volume survives a normal Compose shutdown, but removing that volume can remove the database. Uploaded images use separate storage and can be lost when the current API container is replaced. A database backup alone cannot recover those files.</w:t>
+      </w:r>
+    </w:p>
+    <w:p>
+      <w:pPr>
+        <w:jc w:val="left"/>
+      </w:pPr>
+      <w:r>
+        <w:t>Routine maintenance covers connectivity, storage capacity, API errors, migration state, and growth of uploaded files. Dependency and schema updates require verification against a supported database copy. File cleanup must distinguish current avatar references from files no longer in use.</w:t>
       </w:r>
     </w:p>
     <w:p>
       <w:pPr>
         <w:pStyle w:val="Heading1"/>
+        <w:keepNext/>
+        <w:keepLines/>
+        <w:pageBreakBefore/>
       </w:pPr>
       <w:r>
-        <w:t>Source References</w:t>
+        <w:rPr>
+          <w:color w:val="000000"/>
+        </w:rPr>
+        <w:t>Implementation References</w:t>
       </w:r>
     </w:p>
     <w:p>
+      <w:pPr>
+        <w:jc w:val="left"/>
+      </w:pPr>
       <w:r>
-        <w:t>Repository paths below are relative to the project root. Source references identify implementation locations for integration into the final report; the team should attach the agreed release revision when the submission is frozen.</w:t>
+        <w:t>The following repository locations support the architecture and data definitions in these report sections. Paths are relative to the project root.</w:t>
       </w:r>
     </w:p>
     <w:p>
+      <w:pPr>
+        <w:keepLines/>
+        <w:jc w:val="left"/>
+      </w:pPr>
       <w:r>
-        <w:t>[R1] CHRONO A5 - Task allocation.pdf, pages 5 and 6 for Nhat Minh responsibilities and page 12 for report chapter ownership.</w:t>
+        <w:t>[R1] frontend/web/lib/api.ts; read-cache.ts; tasks.ts; projects.ts; auth-session.ts; components/auth/current-user-provider.tsx. Browser requests, temporary response storage, and session handling.</w:t>
       </w:r>
     </w:p>
     <w:p>
+      <w:pPr>
+        <w:keepLines/>
+        <w:jc w:val="left"/>
+      </w:pPr>
       <w:r>
-        <w:t>[R2] frontend/web/lib/api.ts; frontend/web/lib/auth-session.ts; frontend/web/components/auth/current-user-provider.tsx. Browser API address, tokens and session recovery.</w:t>
+        <w:t>[R2] backend/api/app/main.py; backend/api/app/config.py. Route composition, local CORS, media mount and environment settings.</w:t>
       </w:r>
     </w:p>
     <w:p>
+      <w:pPr>
+        <w:keepLines/>
+        <w:jc w:val="left"/>
+      </w:pPr>
       <w:r>
-        <w:t>[R3] backend/api/app/main.py; backend/api/app/config.py. Route composition, local CORS, media mount and environment settings.</w:t>
+        <w:t>[R3] backend/api/app/database.py; backend/api/alembic/env.py. Engine, request sessions, shared metadata and migration configuration.</w:t>
       </w:r>
     </w:p>
     <w:p>
+      <w:pPr>
+        <w:keepLines/>
+        <w:jc w:val="left"/>
+      </w:pPr>
       <w:r>
-        <w:t>[R4] backend/api/app/database.py; backend/api/alembic/env.py. Engine, request sessions, shared metadata and migration configuration.</w:t>
+        <w:t>[R4] backend/api/app/auth/models.py, schemas.py, security.py, dependencies.py and service.py; backend/api/app/settings/models.py; backend/api/app/timezones.py. Account controls, profile handling and timezones.</w:t>
       </w:r>
     </w:p>
     <w:p>
+      <w:pPr>
+        <w:keepLines/>
+        <w:jc w:val="left"/>
+      </w:pPr>
       <w:r>
-        <w:t>[R5] backend/api/app/auth/models.py, schemas.py, security.py, dependencies.py and service.py; backend/api/app/settings/models.py; backend/api/app/timezones.py. Account controls, profile handling and timezones.</w:t>
+        <w:t>[R5] backend/api/app/projects/models.py and service.py; folders/router.py; tasks/models.py, router.py, service.py, and overdue.py; notifications/models.py; dashboard. Core records, task lifecycle, count aggregation, and dashboard summaries.</w:t>
       </w:r>
     </w:p>
     <w:p>
+      <w:pPr>
+        <w:keepLines/>
+        <w:jc w:val="left"/>
+      </w:pPr>
       <w:r>
-        <w:t>[R6] backend/api/app/projects/models.py and service.py; backend/api/app/folders/router.py; backend/api/app/tasks/models.py, service.py and overdue.py; backend/api/app/notifications/models.py; backend/api/app/dashboard. Core records, task lifecycle and aggregation.</w:t>
+        <w:t>[R6] backend/api/app/focus/models.py; backend/api/app/gamification/models.py. Focus records, forest data and reward constraints.</w:t>
       </w:r>
     </w:p>
     <w:p>
+      <w:pPr>
+        <w:keepLines/>
+        <w:jc w:val="left"/>
+      </w:pPr>
       <w:r>
-        <w:t>[R7] backend/api/app/focus/models.py; backend/api/app/gamification/models.py. Focus records, forest data and reward constraints.</w:t>
+        <w:t>[R7] backend/api/app/scheduling/models.py; backend/api/app/ai/models.py and README.md; backend/api/app/tasks/duration_estimation/models.py. Scheduling proposals, weekly insights, telemetry and duration decision persistence.</w:t>
       </w:r>
     </w:p>
     <w:p>
+      <w:pPr>
+        <w:keepLines/>
+        <w:jc w:val="left"/>
+      </w:pPr>
       <w:r>
-        <w:t>[R8] backend/api/app/scheduling/models.py; backend/api/app/ai/models.py and README.md; backend/api/app/tasks/duration_estimation/models.py. Scheduling proposals, weekly insights, telemetry and duration decision persistence.</w:t>
+        <w:t>[R8] backend/api/alembic/versions. Schema revision history, constraints, and data transformations.</w:t>
       </w:r>
     </w:p>
     <w:p>
+      <w:pPr>
+        <w:keepLines/>
+        <w:jc w:val="left"/>
+      </w:pPr>
       <w:r>
-        <w:t>[R9] backend/api/alembic/versions. Full 32 revision history, including e7f4a2c91b63, a3f7c2e91b64 and d7b2a6e14f09.</w:t>
+        <w:t>[R9] docker-compose.yml; backend/api/Dockerfile; frontend/web/Dockerfile; .dockerignore. Ports, startup commands, volumes and build behaviour.</w:t>
       </w:r>
     </w:p>
     <w:p>
+      <w:pPr>
+        <w:keepLines/>
+        <w:jc w:val="left"/>
+      </w:pPr>
       <w:r>
-        <w:t>[R10] docker-compose.yml; backend/api/Dockerfile; frontend/web/Dockerfile; .dockerignore. Ports, startup commands, volumes and build behaviour.</w:t>
+        <w:t>[R10] backend/api/scripts/seed_mock_data.py. Synthetic demo account, project and task fixtures and rerun behaviour.</w:t>
       </w:r>
     </w:p>
     <w:p>
+      <w:pPr>
+        <w:keepLines/>
+        <w:jc w:val="left"/>
+      </w:pPr>
       <w:r>
-        <w:t>[R11] backend/api/scripts/seed_mock_data.py. Synthetic demo account, project and task fixtures and rerun behaviour.</w:t>
+        <w:t>[R11] package.json; pnpm-lock.yaml; backend/api/pyproject.toml; backend/api/uv.lock; uv.lock; environment example files. Declared runtimes, dependencies, and application configuration.</w:t>
       </w:r>
     </w:p>
     <w:p>
+      <w:pPr>
+        <w:keepLines/>
+        <w:jc w:val="left"/>
+      </w:pPr>
       <w:r>
-        <w:t>[R12] package.json; pnpm-lock.yaml; backend/api/pyproject.toml; backend/api/uv.lock; uv.lock; .gitignore; environment example files. Runtime and dependency configuration and handover exclusions.</w:t>
-      </w:r>
-    </w:p>
-    <w:p>
-      <w:r>
-        <w:t>[R13] backend/api/tests/conftest.py; backend/api/tests/infrastructure/test_database.py. Database fixtures and infrastructure checks; fresh migration and restore results require separate execution evidence.</w:t>
+        <w:t>[R12] backend/api/tests/conftest.py; backend/api/tests/infrastructure/test_database.py. Database verification fixtures and infrastructure checks.</w:t>
       </w:r>
     </w:p>
     <w:sectPr>
       <w:footerReference w:type="default" r:id="rId9"/>
+      <w:footerReference w:type="first" r:id="rId13"/>
+      <w:footerReference w:type="even" r:id="rId14"/>
       <w:pgSz w:w="12240" w:h="15840"/>
       <w:pgMar w:top="936" w:right="1008" w:bottom="936" w:left="1008" w:header="720" w:footer="360" w:gutter="0"/>
       <w:cols w:space="720"/>
@@ -32784,12 +30592,29 @@
       <w:jc w:val="right"/>
     </w:pPr>
     <w:r>
-      <w:rPr>
-        <w:sz w:val="18"/>
-      </w:rPr>
-      <w:t xml:space="preserve">CHRONO A5  |  Minh  |  </w:t>
+      <w:t xml:space="preserve">Chrono | </w:t>
     </w:r>
     <w:fldSimple w:instr="PAGE"/>
+  </w:p>
+</w:ftr>
+</file>
+
+<file path=word/footer2.xml><?xml version="1.0" encoding="utf-8"?>
+<w:ftr xmlns:m="http://schemas.openxmlformats.org/officeDocument/2006/math" xmlns:mc="http://schemas.openxmlformats.org/markup-compatibility/2006" xmlns:mo="http://schemas.microsoft.com/office/mac/office/2008/main" xmlns:mv="urn:schemas-microsoft-com:mac:vml" xmlns:o="urn:schemas-microsoft-com:office:office" xmlns:r="http://schemas.openxmlformats.org/officeDocument/2006/relationships" xmlns:v="urn:schemas-microsoft-com:vml" xmlns:w10="urn:schemas-microsoft-com:office:word" xmlns:w14="http://schemas.microsoft.com/office/word/2010/wordml" xmlns:w="http://schemas.openxmlformats.org/wordprocessingml/2006/main" xmlns:wne="http://schemas.microsoft.com/office/word/2006/wordml" xmlns:wp14="http://schemas.microsoft.com/office/word/2010/wordprocessingDrawing" xmlns:wp="http://schemas.openxmlformats.org/drawingml/2006/wordprocessingDrawing" xmlns:wpc="http://schemas.microsoft.com/office/word/2010/wordprocessingCanvas" xmlns:wpg="http://schemas.microsoft.com/office/word/2010/wordprocessingGroup" xmlns:wpi="http://schemas.microsoft.com/office/word/2010/wordprocessingInk" xmlns:wps="http://schemas.microsoft.com/office/word/2010/wordprocessingShape" mc:Ignorable="w14 wp14">
+  <w:p>
+    <w:pPr>
+      <w:pStyle w:val="Footer"/>
+    </w:pPr>
+  </w:p>
+</w:ftr>
+</file>
+
+<file path=word/footer3.xml><?xml version="1.0" encoding="utf-8"?>
+<w:ftr xmlns:m="http://schemas.openxmlformats.org/officeDocument/2006/math" xmlns:mc="http://schemas.openxmlformats.org/markup-compatibility/2006" xmlns:mo="http://schemas.microsoft.com/office/mac/office/2008/main" xmlns:mv="urn:schemas-microsoft-com:mac:vml" xmlns:o="urn:schemas-microsoft-com:office:office" xmlns:r="http://schemas.openxmlformats.org/officeDocument/2006/relationships" xmlns:v="urn:schemas-microsoft-com:vml" xmlns:w10="urn:schemas-microsoft-com:office:word" xmlns:w14="http://schemas.microsoft.com/office/word/2010/wordml" xmlns:w="http://schemas.openxmlformats.org/wordprocessingml/2006/main" xmlns:wne="http://schemas.microsoft.com/office/word/2006/wordml" xmlns:wp14="http://schemas.microsoft.com/office/word/2010/wordprocessingDrawing" xmlns:wp="http://schemas.openxmlformats.org/drawingml/2006/wordprocessingDrawing" xmlns:wpc="http://schemas.microsoft.com/office/word/2010/wordprocessingCanvas" xmlns:wpg="http://schemas.microsoft.com/office/word/2010/wordprocessingGroup" xmlns:wpi="http://schemas.microsoft.com/office/word/2010/wordprocessingInk" xmlns:wps="http://schemas.microsoft.com/office/word/2010/wordprocessingShape" mc:Ignorable="w14 wp14">
+  <w:p>
+    <w:pPr>
+      <w:pStyle w:val="Footer"/>
+    </w:pPr>
   </w:p>
 </w:ftr>
 </file>

</xml_diff>